<commit_message>
docs: preenche capa, objetivos e referencias do documento de Resultados Preliminares (#22)
Preenche os marcadores do documento oficial em conjunto com o autor:
- capa: titulo conclusivo escolhido, autor (Gabriel Arcenio Rahal Marostica),
  orientador (Jose Bernardo Neto) e curso (MBA Eng. de Software, USP/Esalq 2026);
- introducao: objetivos especificos (a-e) e citacoes no texto;
- referencias: 7 obras reais e verificadas por busca (Spider, EHRSQL, BIRD,
  survey de LLM Text-to-SQL, LGPD, ANVISA RDC 657/2022, ANPD Radar IA Generativa),
  em ordem alfabetica e estilo ABNT, com nota para o autor conferir e completar.

Nenhuma citacao foi inventada (RNC-002): as referencias foram verificadas quanto
a existencia e metadados; cabe ao autor confirmar a consulta e ajustar a ABNT.
Renomeia o gerador para .cjs (executa fora do escopo ESM). Documento validado
(validate.py); 9 paginas (teto 30).

Closes #20
</commit_message>
<xml_diff>
--- a/docs/tcc/Resultados_Preliminares_TCC.docx
+++ b/docs/tcc/Resultados_Preliminares_TCC.docx
@@ -4,7 +4,7 @@
   <w:body>
     <w:p>
       <w:pPr>
-        <w:spacing w:after="120"/>
+        <w:spacing w:after="240"/>
         <w:jc w:val="center"/>
       </w:pPr>
       <w:r>
@@ -14,7 +14,33 @@
           <w:sz w:val="30"/>
           <w:szCs w:val="30"/>
         </w:rPr>
-        <w:t xml:space="preserve">Arquitetura de referência com governança integrada para consulta em linguagem natural sobre ocupação de leitos</w:t>
+        <w:t xml:space="preserve">Governança integrada habilita consulta em linguagem natural sobre ocupação de leitos hospitalares</w:t>
+      </w:r>
+    </w:p>
+    <w:p>
+      <w:pPr>
+        <w:spacing w:after="80"/>
+        <w:jc w:val="center"/>
+      </w:pPr>
+      <w:r>
+        <w:rPr>
+          <w:sz w:val="24"/>
+          <w:szCs w:val="24"/>
+        </w:rPr>
+        <w:t xml:space="preserve">Gabriel Arcenio Rahal Marostica</w:t>
+      </w:r>
+    </w:p>
+    <w:p>
+      <w:pPr>
+        <w:spacing w:after="80"/>
+        <w:jc w:val="center"/>
+      </w:pPr>
+      <w:r>
+        <w:rPr>
+          <w:sz w:val="24"/>
+          <w:szCs w:val="24"/>
+        </w:rPr>
+        <w:t xml:space="preserve">Orientador: José Bernardo Neto</w:t>
       </w:r>
     </w:p>
     <w:p>
@@ -24,54 +50,10 @@
       </w:pPr>
       <w:r>
         <w:rPr>
-          <w:i/>
-          <w:iCs/>
-          <w:sz w:val="18"/>
-          <w:szCs w:val="18"/>
+          <w:sz w:val="24"/>
+          <w:szCs w:val="24"/>
         </w:rPr>
-        <w:t xml:space="preserve">[SUGESTÃO de título, 15 palavras; ajuste se desejar]</w:t>
-      </w:r>
-    </w:p>
-    <w:p>
-      <w:pPr>
-        <w:spacing w:after="120" w:line="360"/>
-        <w:jc w:val="both"/>
-      </w:pPr>
-      <w:r>
-        <w:rPr>
-          <w:b/>
-          <w:bCs/>
-        </w:rPr>
-        <w:t xml:space="preserve">[preencher: Nome do(s) autor(es)]</w:t>
-      </w:r>
-    </w:p>
-    <w:p>
-      <w:pPr>
-        <w:spacing w:after="120" w:line="360"/>
-        <w:jc w:val="both"/>
-      </w:pPr>
-      <w:r>
-        <w:rPr>
-          <w:b/>
-          <w:bCs/>
-        </w:rPr>
-        <w:t xml:space="preserve">[preencher: Nome do(a) orientador(a)]</w:t>
-      </w:r>
-    </w:p>
-    <w:p>
-      <w:pPr>
-        <w:spacing w:after="120" w:line="360"/>
-        <w:jc w:val="both"/>
-      </w:pPr>
-      <w:r>
-        <w:t xml:space="preserve">MBA em Engenharia de Software — USP/Esalq. </w:t>
-      </w:r>
-      <w:r>
-        <w:rPr>
-          <w:b/>
-          <w:bCs/>
-        </w:rPr>
-        <w:t xml:space="preserve">[preencher: ano/turma]</w:t>
+        <w:t xml:space="preserve">MBA em Engenharia de Software — USP/Esalq, 2026</w:t>
       </w:r>
     </w:p>
     <w:p>
@@ -123,7 +105,7 @@
         <w:jc w:val="both"/>
       </w:pPr>
       <w:r>
-        <w:t xml:space="preserve">A adoção de modelos de linguagem para consulta a dados clínicos em linguagem natural promete ampliar o acesso de gestores e equipes assistenciais à informação, mas esbarra em um obstáculo central: a governança dos dados e do próprio modelo costuma ser tratada de forma fragmentada, separada da arquitetura de dados. Em saúde, essa fragmentação é crítica, pois envolve dados pessoais sensíveis e um marco regulatório exigente, composto pela Lei Geral de Proteção de Dados, pelas normas da ANVISA aplicáveis a software como dispositivo médico e pelas diretrizes da Autoridade Nacional de Proteção de Dados.</w:t>
+        <w:t xml:space="preserve">A tradução de perguntas em linguagem natural para consultas SQL (Text-to-SQL) é objeto de pesquisa consolidado, com benchmarks de referência como o Spider (YU et al., 2018) e, no domínio clínico, o EHRSQL (LEE et al., 2022), e tem sido profundamente transformada pelos modelos de linguagem de grande porte (SHI et al., 2024). A adoção desses modelos para consulta a dados clínicos em linguagem natural promete ampliar o acesso de gestores e equipes assistenciais à informação, mas esbarra em um obstáculo central: a governança dos dados e do próprio modelo costuma ser tratada de forma fragmentada, separada da arquitetura de dados. Em saúde, essa fragmentação é crítica, pois envolve dados pessoais sensíveis e um marco regulatório exigente, composto pela Lei Geral de Proteção de Dados (BRASIL, 2018), pelas normas da ANVISA aplicáveis a software como dispositivo médico (ANVISA, 2022) e pelas diretrizes da Autoridade Nacional de Proteção de Dados (ANPD, 2024).</w:t>
       </w:r>
     </w:p>
     <w:p>
@@ -141,17 +123,7 @@
         <w:jc w:val="both"/>
       </w:pPr>
       <w:r>
-        <w:t xml:space="preserve">O objetivo geral é demonstrar, por meio de um protótipo funcional, a viabilidade dessa arquitetura integrada e avaliar a acurácia do motor de tradução de perguntas em SQL sobre dados sintéticos, sob a hipótese de acurácia superior a 80%. </w:t>
-      </w:r>
-      <w:r>
-        <w:rPr>
-          <w:b/>
-          <w:bCs/>
-        </w:rPr>
-        <w:t xml:space="preserve">[preencher: complementar com objetivos específicos e referências da revisão de literatura do projeto de pesquisa]</w:t>
-      </w:r>
-      <w:r>
-        <w:t xml:space="preserve">.</w:t>
+        <w:t xml:space="preserve">O objetivo geral é demonstrar, por meio de um protótipo funcional, a viabilidade dessa arquitetura integrada e avaliar a acurácia do motor de tradução de perguntas em SQL sobre dados sintéticos, sob a hipótese de acurácia superior a 80%. Como objetivos específicos, o trabalho se propõe a: (a) revisar a literatura sobre Conversational Analytics, Text-to-SQL e governança de modelos de linguagem; (b) mapear os requisitos regulatórios aplicáveis (LGPD, ANVISA e ANPD); (c) projetar a arquitetura técnica, da ingestão ao Lakehouse e ao motor com guardrails; (d) desenvolver o modelo de governança, contemplando controle de acesso, rastreabilidade, anonimização e validação; e (e) implementar e avaliar o protótipo sobre dados sintéticos.</w:t>
       </w:r>
     </w:p>
     <w:p>
@@ -259,7 +231,7 @@
         <w:jc w:val="both"/>
       </w:pPr>
       <w:r>
-        <w:t xml:space="preserve">A avaliação adota a métrica de execution match, no estilo do benchmark EHRSQL: a consulta gerada pelo modelo e a consulta de referência são executadas e seus conjuntos de resultados são comparados após normalização (arredondamento numérico com tolerância de duas casas, datas em formato ISO e linhas ordenadas). Além da acurácia, são medidos dois indicadores de governança: a taxa de aprovação das consultas pelos guardrails e a completude do log de auditoria. O conjunto de avaliação reúne dezoito perguntas em português, com a respectiva consulta de referência sobre a Gold, cobrindo quatro tipos de pergunta operacional: status atual, métrica por unidade, série histórica e internações por faixa etária. O motor existe em duas implementações intercambiáveis: o oráculo, que devolve a consulta de referência e serve apenas para autoteste da tubulação, e o modelo de linguagem real, que gera os números reportados.</w:t>
+        <w:t xml:space="preserve">A avaliação adota a métrica de execution match, consolidada em benchmarks de Text-to-SQL como o Spider (YU et al., 2018), o EHRSQL (LEE et al., 2022) e o BIRD (LI et al., 2023): a consulta gerada pelo modelo e a consulta de referência são executadas e seus conjuntos de resultados são comparados após normalização (arredondamento numérico com tolerância de duas casas, datas em formato ISO e linhas ordenadas). Além da acurácia, são medidos dois indicadores de governança: a taxa de aprovação das consultas pelos guardrails e a completude do log de auditoria. O conjunto de avaliação reúne dezoito perguntas em português, com a respectiva consulta de referência sobre a Gold, cobrindo quatro tipos de pergunta operacional: status atual, métrica por unidade, série histórica e internações por faixa etária. O motor existe em duas implementações intercambiáveis: o oráculo, que devolve a consulta de referência e serve apenas para autoteste da tubulação, e o modelo de linguagem real, que gera os números reportados.</w:t>
       </w:r>
     </w:p>
     <w:p>
@@ -3220,14 +3192,86 @@
     <w:p>
       <w:pPr>
         <w:spacing w:after="120" w:line="360"/>
-        <w:jc w:val="both"/>
+        <w:ind w:left="480" w:hanging="480"/>
+        <w:jc w:val="left"/>
+      </w:pPr>
+      <w:r>
+        <w:t xml:space="preserve">AGÊNCIA NACIONAL DE VIGILÂNCIA SANITÁRIA (ANVISA). Resolução da Diretoria Colegiada – RDC nº 657, de 24 de março de 2022. Dispõe sobre a regularização de software como dispositivo médico (Software as a Medical Device – SaMD). Brasília, DF: Anvisa, 2022.</w:t>
+      </w:r>
+    </w:p>
+    <w:p>
+      <w:pPr>
+        <w:spacing w:after="120" w:line="360"/>
+        <w:ind w:left="480" w:hanging="480"/>
+        <w:jc w:val="left"/>
+      </w:pPr>
+      <w:r>
+        <w:t xml:space="preserve">AUTORIDADE NACIONAL DE PROTEÇÃO DE DADOS (ANPD). Radar tecnológico: inteligência artificial generativa. Brasília, DF: ANPD, 2024.</w:t>
+      </w:r>
+    </w:p>
+    <w:p>
+      <w:pPr>
+        <w:spacing w:after="120" w:line="360"/>
+        <w:ind w:left="480" w:hanging="480"/>
+        <w:jc w:val="left"/>
+      </w:pPr>
+      <w:r>
+        <w:t xml:space="preserve">BRASIL. Lei nº 13.709, de 14 de agosto de 2018. Lei Geral de Proteção de Dados Pessoais (LGPD). Brasília, DF: Presidência da República, 2018.</w:t>
+      </w:r>
+    </w:p>
+    <w:p>
+      <w:pPr>
+        <w:spacing w:after="120" w:line="360"/>
+        <w:ind w:left="480" w:hanging="480"/>
+        <w:jc w:val="left"/>
+      </w:pPr>
+      <w:r>
+        <w:t xml:space="preserve">LEE, G.; HWANG, H.; BAE, S.; KWON, Y.; SHIN, W.; YANG, S.; SEO, M.; KIM, J.-Y.; CHOI, E. EHRSQL: a practical text-to-SQL benchmark for electronic health records. In: Advances in Neural Information Processing Systems (NeurIPS) – Datasets and Benchmarks Track, 2022. arXiv:2301.07695.</w:t>
+      </w:r>
+    </w:p>
+    <w:p>
+      <w:pPr>
+        <w:spacing w:after="120" w:line="360"/>
+        <w:ind w:left="480" w:hanging="480"/>
+        <w:jc w:val="left"/>
+      </w:pPr>
+      <w:r>
+        <w:t xml:space="preserve">LI, J.; HUI, B.; QU, G. et al. Can LLM already serve as a database interface? A big bench for large-scale database grounded text-to-SQLs (BIRD). In: Advances in Neural Information Processing Systems (NeurIPS) – Datasets and Benchmarks Track, 2023. arXiv:2305.03111.</w:t>
+      </w:r>
+    </w:p>
+    <w:p>
+      <w:pPr>
+        <w:spacing w:after="120" w:line="360"/>
+        <w:ind w:left="480" w:hanging="480"/>
+        <w:jc w:val="left"/>
+      </w:pPr>
+      <w:r>
+        <w:t xml:space="preserve">SHI, L.; TANG, Z.; ZHANG, N.; ZHANG, X.; YANG, Z. A survey on employing large language models for text-to-SQL tasks. ACM Computing Surveys, 2024. arXiv:2407.15186.</w:t>
+      </w:r>
+    </w:p>
+    <w:p>
+      <w:pPr>
+        <w:spacing w:after="120" w:line="360"/>
+        <w:ind w:left="480" w:hanging="480"/>
+        <w:jc w:val="left"/>
+      </w:pPr>
+      <w:r>
+        <w:t xml:space="preserve">YU, T.; ZHANG, R.; YANG, K.; YASUNAGA, M.; WANG, D.; LI, Z.; MA, J.; LI, I.; YAO, Q.; ROMAN, S.; ZHANG, Z.; RADEV, D. Spider: a large-scale human-labeled dataset for complex and cross-domain semantic parsing and text-to-SQL task. In: Proceedings of the 2018 Conference on Empirical Methods in Natural Language Processing (EMNLP), 2018. arXiv:1809.08887.</w:t>
+      </w:r>
+    </w:p>
+    <w:p>
+      <w:pPr>
+        <w:spacing w:before="120"/>
       </w:pPr>
       <w:r>
         <w:rPr>
-          <w:b/>
-          <w:bCs/>
+          <w:i/>
+          <w:iCs/>
+          <w:color w:val="777777"/>
+          <w:sz w:val="18"/>
+          <w:szCs w:val="18"/>
         </w:rPr>
-        <w:t xml:space="preserve">[preencher: referências do projeto de pesquisa, formatadas pelas normas USP/Esalq. Não inseridas automaticamente para não fabricar citações.]</w:t>
+        <w:t xml:space="preserve">Nota (remover antes do depósito): referências reais, verificadas, propostas para os temas do trabalho. Confirme que foram efetivamente consultadas, ajuste à formatação ABNT da USP/Esalq (data de acesso, DOI/URL) e acrescente as demais obras da sua revisão de literatura.</w:t>
       </w:r>
     </w:p>
     <w:p>
@@ -3252,14 +3296,14 @@
         </w:tblBorders>
       </w:tblPr>
       <w:tblGrid>
-        <w:gridCol w:w="1471"/>
-        <w:gridCol w:w="5200"/>
-        <w:gridCol w:w="2400"/>
+        <w:gridCol w:w="2051"/>
+        <w:gridCol w:w="4920"/>
+        <w:gridCol w:w="2100"/>
       </w:tblGrid>
       <w:tr>
         <w:tc>
           <w:tcPr>
-            <w:tcW w:type="dxa" w:w="1471"/>
+            <w:tcW w:type="dxa" w:w="2051"/>
             <w:tcBorders>
               <w:top w:val="single" w:color="999999" w:sz="1"/>
               <w:left w:val="single" w:color="999999" w:sz="1"/>
@@ -3289,7 +3333,7 @@
         </w:tc>
         <w:tc>
           <w:tcPr>
-            <w:tcW w:type="dxa" w:w="5200"/>
+            <w:tcW w:type="dxa" w:w="4920"/>
             <w:tcBorders>
               <w:top w:val="single" w:color="999999" w:sz="1"/>
               <w:left w:val="single" w:color="999999" w:sz="1"/>
@@ -3319,7 +3363,7 @@
         </w:tc>
         <w:tc>
           <w:tcPr>
-            <w:tcW w:type="dxa" w:w="2400"/>
+            <w:tcW w:type="dxa" w:w="2100"/>
             <w:tcBorders>
               <w:top w:val="single" w:color="999999" w:sz="1"/>
               <w:left w:val="single" w:color="999999" w:sz="1"/>
@@ -3351,7 +3395,7 @@
       <w:tr>
         <w:tc>
           <w:tcPr>
-            <w:tcW w:type="dxa" w:w="1471"/>
+            <w:tcW w:type="dxa" w:w="2051"/>
             <w:tcBorders>
               <w:top w:val="single" w:color="999999" w:sz="1"/>
               <w:left w:val="single" w:color="999999" w:sz="1"/>
@@ -3380,7 +3424,7 @@
         </w:tc>
         <w:tc>
           <w:tcPr>
-            <w:tcW w:type="dxa" w:w="5200"/>
+            <w:tcW w:type="dxa" w:w="4920"/>
             <w:tcBorders>
               <w:top w:val="single" w:color="999999" w:sz="1"/>
               <w:left w:val="single" w:color="999999" w:sz="1"/>
@@ -3409,7 +3453,7 @@
         </w:tc>
         <w:tc>
           <w:tcPr>
-            <w:tcW w:type="dxa" w:w="2400"/>
+            <w:tcW w:type="dxa" w:w="2100"/>
             <w:tcBorders>
               <w:top w:val="single" w:color="999999" w:sz="1"/>
               <w:left w:val="single" w:color="999999" w:sz="1"/>
@@ -3440,7 +3484,7 @@
       <w:tr>
         <w:tc>
           <w:tcPr>
-            <w:tcW w:type="dxa" w:w="1471"/>
+            <w:tcW w:type="dxa" w:w="2051"/>
             <w:tcBorders>
               <w:top w:val="single" w:color="999999" w:sz="1"/>
               <w:left w:val="single" w:color="999999" w:sz="1"/>
@@ -3469,7 +3513,7 @@
         </w:tc>
         <w:tc>
           <w:tcPr>
-            <w:tcW w:type="dxa" w:w="5200"/>
+            <w:tcW w:type="dxa" w:w="4920"/>
             <w:tcBorders>
               <w:top w:val="single" w:color="999999" w:sz="1"/>
               <w:left w:val="single" w:color="999999" w:sz="1"/>
@@ -3498,7 +3542,7 @@
         </w:tc>
         <w:tc>
           <w:tcPr>
-            <w:tcW w:type="dxa" w:w="2400"/>
+            <w:tcW w:type="dxa" w:w="2100"/>
             <w:tcBorders>
               <w:top w:val="single" w:color="999999" w:sz="1"/>
               <w:left w:val="single" w:color="999999" w:sz="1"/>
@@ -3529,7 +3573,7 @@
       <w:tr>
         <w:tc>
           <w:tcPr>
-            <w:tcW w:type="dxa" w:w="1471"/>
+            <w:tcW w:type="dxa" w:w="2051"/>
             <w:tcBorders>
               <w:top w:val="single" w:color="999999" w:sz="1"/>
               <w:left w:val="single" w:color="999999" w:sz="1"/>
@@ -3558,7 +3602,7 @@
         </w:tc>
         <w:tc>
           <w:tcPr>
-            <w:tcW w:type="dxa" w:w="5200"/>
+            <w:tcW w:type="dxa" w:w="4920"/>
             <w:tcBorders>
               <w:top w:val="single" w:color="999999" w:sz="1"/>
               <w:left w:val="single" w:color="999999" w:sz="1"/>
@@ -3587,7 +3631,7 @@
         </w:tc>
         <w:tc>
           <w:tcPr>
-            <w:tcW w:type="dxa" w:w="2400"/>
+            <w:tcW w:type="dxa" w:w="2100"/>
             <w:tcBorders>
               <w:top w:val="single" w:color="999999" w:sz="1"/>
               <w:left w:val="single" w:color="999999" w:sz="1"/>
@@ -3618,7 +3662,7 @@
       <w:tr>
         <w:tc>
           <w:tcPr>
-            <w:tcW w:type="dxa" w:w="1471"/>
+            <w:tcW w:type="dxa" w:w="2051"/>
             <w:tcBorders>
               <w:top w:val="single" w:color="999999" w:sz="1"/>
               <w:left w:val="single" w:color="999999" w:sz="1"/>
@@ -3647,7 +3691,7 @@
         </w:tc>
         <w:tc>
           <w:tcPr>
-            <w:tcW w:type="dxa" w:w="5200"/>
+            <w:tcW w:type="dxa" w:w="4920"/>
             <w:tcBorders>
               <w:top w:val="single" w:color="999999" w:sz="1"/>
               <w:left w:val="single" w:color="999999" w:sz="1"/>
@@ -3676,7 +3720,7 @@
         </w:tc>
         <w:tc>
           <w:tcPr>
-            <w:tcW w:type="dxa" w:w="2400"/>
+            <w:tcW w:type="dxa" w:w="2100"/>
             <w:tcBorders>
               <w:top w:val="single" w:color="999999" w:sz="1"/>
               <w:left w:val="single" w:color="999999" w:sz="1"/>
@@ -3731,7 +3775,7 @@
           <w:sz w:val="18"/>
           <w:szCs w:val="18"/>
         </w:rPr>
-        <w:t xml:space="preserve">Nota: documento de apoio gerado a partir da documentação do protótipo (RES-001 a RES-007). Remover esta nota e os marcadores [preencher] / [SUGESTÃO] antes do depósito. Teto de 30 páginas; redação no pretérito impessoal.</w:t>
+        <w:t xml:space="preserve">Nota (remover antes do depósito): documento de apoio gerado a partir da documentação do protótipo (RES-001 a RES-007). Capa, objetivos e referências já preenchidos; confira a formatação ABNT da USP/Esalq e acrescente as demais obras da revisão de literatura. Teto de 30 páginas; redação no pretérito impessoal.</w:t>
       </w:r>
     </w:p>
     <w:sectPr>

</xml_diff>

<commit_message>
docs: resumo, referencias extras, apendices e citacoes no documento (#24)
Complementa o documento oficial de Resultados Preliminares:
- Resumo finalizado (remove rotulo "opcional");
- 3 referencias reais e verificadas (NIST AI RMF 2023; SWEENEY k-anonymity
  2002; AFFOLTER; STOCKINGER; BERNSTEIN, VLDB 2019), totalizando 10;
- Apendice A com diagrama das quatro camadas (Figura A.1, PNG gerado de SVG
  versionado) e Quadro A.1; Apendice B com a tabela requisito x controle
  (Quadro B.1, 11 requisitos REG-*);
- citacoes adicionais: NLI na Introducao, NIST na Metodologia, SWEENEY e BIRD
  nos Resultados.

Nenhuma citacao inventada (RNC-002); metadados verificados via busca.
Documento validado (validate.py); 11 paginas (teto 30).

Closes #23
</commit_message>
<xml_diff>
--- a/docs/tcc/Resultados_Preliminares_TCC.docx
+++ b/docs/tcc/Resultados_Preliminares_TCC.docx
@@ -62,7 +62,7 @@
         <w:spacing w:after="120" w:before="200"/>
       </w:pPr>
       <w:r>
-        <w:t xml:space="preserve">Resumo (opcional nesta etapa)</w:t>
+        <w:t xml:space="preserve">Resumo</w:t>
       </w:r>
     </w:p>
     <w:p>
@@ -105,7 +105,7 @@
         <w:jc w:val="both"/>
       </w:pPr>
       <w:r>
-        <w:t xml:space="preserve">A tradução de perguntas em linguagem natural para consultas SQL (Text-to-SQL) é objeto de pesquisa consolidado, com benchmarks de referência como o Spider (YU et al., 2018) e, no domínio clínico, o EHRSQL (LEE et al., 2022), e tem sido profundamente transformada pelos modelos de linguagem de grande porte (SHI et al., 2024). A adoção desses modelos para consulta a dados clínicos em linguagem natural promete ampliar o acesso de gestores e equipes assistenciais à informação, mas esbarra em um obstáculo central: a governança dos dados e do próprio modelo costuma ser tratada de forma fragmentada, separada da arquitetura de dados. Em saúde, essa fragmentação é crítica, pois envolve dados pessoais sensíveis e um marco regulatório exigente, composto pela Lei Geral de Proteção de Dados (BRASIL, 2018), pelas normas da ANVISA aplicáveis a software como dispositivo médico (ANVISA, 2022) e pelas diretrizes da Autoridade Nacional de Proteção de Dados (ANPD, 2024).</w:t>
+        <w:t xml:space="preserve">As interfaces em linguagem natural para bancos de dados são um campo de pesquisa maduro (AFFOLTER; STOCKINGER; BERNSTEIN, 2019). Em particular, a tradução de perguntas em linguagem natural para consultas SQL (Text-to-SQL) é objeto de estudo consolidado, com benchmarks de referência como o Spider (YU et al., 2018) e, no domínio clínico, o EHRSQL (LEE et al., 2022), e tem sido profundamente transformada pelos modelos de linguagem de grande porte (SHI et al., 2024). A adoção desses modelos para consulta a dados clínicos em linguagem natural promete ampliar o acesso de gestores e equipes assistenciais à informação, mas esbarra em um obstáculo central: a governança dos dados e do próprio modelo costuma ser tratada de forma fragmentada, separada da arquitetura de dados. Em saúde, essa fragmentação é crítica, pois envolve dados pessoais sensíveis e um marco regulatório exigente, composto pela Lei Geral de Proteção de Dados (BRASIL, 2018), pelas normas da ANVISA aplicáveis a software como dispositivo médico (ANVISA, 2022) e pelas diretrizes da Autoridade Nacional de Proteção de Dados (ANPD, 2024).</w:t>
       </w:r>
     </w:p>
     <w:p>
@@ -195,7 +195,7 @@
         <w:jc w:val="both"/>
       </w:pPr>
       <w:r>
-        <w:t xml:space="preserve">A governança foi concebida como defesa em profundidade. Na entrada, seis guardrails verificam que a consulta candidata é uma única instrução somente leitura, sem comandos de escrita ou administrativos, restrita às tabelas Gold autorizadas ao perfil do usuário, e a execução ocorre sobre uma conexão de banco somente leitura. Na saída, a validação confere o aterramento da consulta contra o schema Gold conhecido, bloqueia qualquer coluna de resultado cujo nome corresponda a um campo sensível e registra cada pergunta e cada resposta em uma trilha de auditoria, com o evento da interação.</w:t>
+        <w:t xml:space="preserve">A governança foi concebida como defesa em profundidade, alinhada às boas práticas de gestão de risco de sistemas de inteligência artificial (NIST, 2023). Na entrada, seis guardrails verificam que a consulta candidata é uma única instrução somente leitura, sem comandos de escrita ou administrativos, restrita às tabelas Gold autorizadas ao perfil do usuário, e a execução ocorre sobre uma conexão de banco somente leitura. Na saída, a validação confere o aterramento da consulta contra o schema Gold conhecido, bloqueia qualquer coluna de resultado cujo nome corresponda a um campo sensível e registra cada pergunta e cada resposta em uma trilha de auditoria, com o evento da interação.</w:t>
       </w:r>
     </w:p>
     <w:p>
@@ -290,7 +290,7 @@
         <w:jc w:val="both"/>
       </w:pPr>
       <w:r>
-        <w:t xml:space="preserve">A geração produziu, de forma determinista, oito unidades, duzentos leitos, seiscentos pacientes, 2.012 internações e 18.000 registros de ocupação diária. No dia de referência (31 de maio de 2026), o hospital apresentava 150 leitos ocupados, 42 livres e 8 bloqueados, o que corresponde a uma taxa de ocupação de 75,0%. A coerência foi verificada: as 150 internações ativas igualaram exatamente os 150 leitos ocupados no dia de referência. A transformação para as camadas Silver e Gold confirmou a anonimização: a tabela de pacientes da Silver não contém nome, CPF nem data de nascimento; o identificador do paciente foi substituído por um pseudônimo derivado de hash com salt, sem colisão entre os seiscentos pacientes; e a data de nascimento deu lugar à faixa etária. A Tabela 1 resume o snapshot de ocupação por unidade.</w:t>
+        <w:t xml:space="preserve">A geração produziu, de forma determinista, oito unidades, duzentos leitos, seiscentos pacientes, 2.012 internações e 18.000 registros de ocupação diária. No dia de referência (31 de maio de 2026), o hospital apresentava 150 leitos ocupados, 42 livres e 8 bloqueados, o que corresponde a uma taxa de ocupação de 75,0%. A coerência foi verificada: as 150 internações ativas igualaram exatamente os 150 leitos ocupados no dia de referência. A transformação para as camadas Silver e Gold confirmou a anonimização: a tabela de pacientes da Silver não contém nome, CPF nem data de nascimento; o identificador do paciente foi substituído por um pseudônimo derivado de hash com salt, sem colisão entre os seiscentos pacientes; e a data de nascimento deu lugar à faixa etária, em linha com os princípios de anonimização e generalização de atributos identificadores (SWEENEY, 2002). A Tabela 1 resume o snapshot de ocupação por unidade.</w:t>
       </w:r>
     </w:p>
     <w:tbl>
@@ -2172,7 +2172,7 @@
         <w:jc w:val="both"/>
       </w:pPr>
       <w:r>
-        <w:t xml:space="preserve">A primeira execução com o modelo de linguagem real forneceu os primeiros números de acurácia. Sobre o conjunto inicial de dez perguntas, o execution match estrito foi de 60,0%. Após a correção de uma inconsistência interna do harness de medição (o arredondamento embutido na consulta de referência) e a ampliação do conjunto para dezoito perguntas, o execution match foi de 61,1%. A estabilidade do valor com o conjunto quase dobrado indica que a medida não foi fortuita. A Tabela 2 reporta as duas execuções lado a lado.</w:t>
+        <w:t xml:space="preserve">A primeira execução com o modelo de linguagem real forneceu os primeiros números de acurácia. Sobre o conjunto inicial de dez perguntas, o execution match estrito foi de 60,0%. Após a correção de uma inconsistência interna do harness de medição (o arredondamento embutido na consulta de referência) e a ampliação do conjunto para dezoito perguntas, o execution match foi de 61,1%. A estabilidade do valor com o conjunto quase dobrado indica que a medida não foi fortuita. Esse patamar é coerente com a literatura, na qual mesmo modelos avançados alcançam acurácia limitada em benchmarks realistas, a exemplo dos cerca de 40% relatados para o ChatGPT no BIRD (LI et al., 2023). A Tabela 2 reporta as duas execuções lado a lado.</w:t>
       </w:r>
     </w:p>
     <w:tbl>
@@ -3196,7 +3196,7 @@
         <w:jc w:val="left"/>
       </w:pPr>
       <w:r>
-        <w:t xml:space="preserve">AGÊNCIA NACIONAL DE VIGILÂNCIA SANITÁRIA (ANVISA). Resolução da Diretoria Colegiada – RDC nº 657, de 24 de março de 2022. Dispõe sobre a regularização de software como dispositivo médico (Software as a Medical Device – SaMD). Brasília, DF: Anvisa, 2022.</w:t>
+        <w:t xml:space="preserve">AFFOLTER, K.; STOCKINGER, K.; BERNSTEIN, A. A comparative survey of recent natural language interfaces for databases. The VLDB Journal, v. 28, n. 5, p. 793-819, 2019. DOI: 10.1007/s00778-019-00567-8.</w:t>
       </w:r>
     </w:p>
     <w:p>
@@ -3206,7 +3206,7 @@
         <w:jc w:val="left"/>
       </w:pPr>
       <w:r>
-        <w:t xml:space="preserve">AUTORIDADE NACIONAL DE PROTEÇÃO DE DADOS (ANPD). Radar tecnológico: inteligência artificial generativa. Brasília, DF: ANPD, 2024.</w:t>
+        <w:t xml:space="preserve">AGÊNCIA NACIONAL DE VIGILÂNCIA SANITÁRIA (ANVISA). Resolução da Diretoria Colegiada – RDC nº 657, de 24 de março de 2022. Dispõe sobre a regularização de software como dispositivo médico (Software as a Medical Device – SaMD). Brasília, DF: Anvisa, 2022.</w:t>
       </w:r>
     </w:p>
     <w:p>
@@ -3216,7 +3216,7 @@
         <w:jc w:val="left"/>
       </w:pPr>
       <w:r>
-        <w:t xml:space="preserve">BRASIL. Lei nº 13.709, de 14 de agosto de 2018. Lei Geral de Proteção de Dados Pessoais (LGPD). Brasília, DF: Presidência da República, 2018.</w:t>
+        <w:t xml:space="preserve">AUTORIDADE NACIONAL DE PROTEÇÃO DE DADOS (ANPD). Radar tecnológico: inteligência artificial generativa. Brasília, DF: ANPD, 2024.</w:t>
       </w:r>
     </w:p>
     <w:p>
@@ -3226,7 +3226,7 @@
         <w:jc w:val="left"/>
       </w:pPr>
       <w:r>
-        <w:t xml:space="preserve">LEE, G.; HWANG, H.; BAE, S.; KWON, Y.; SHIN, W.; YANG, S.; SEO, M.; KIM, J.-Y.; CHOI, E. EHRSQL: a practical text-to-SQL benchmark for electronic health records. In: Advances in Neural Information Processing Systems (NeurIPS) – Datasets and Benchmarks Track, 2022. arXiv:2301.07695.</w:t>
+        <w:t xml:space="preserve">BRASIL. Lei nº 13.709, de 14 de agosto de 2018. Lei Geral de Proteção de Dados Pessoais (LGPD). Brasília, DF: Presidência da República, 2018.</w:t>
       </w:r>
     </w:p>
     <w:p>
@@ -3236,7 +3236,7 @@
         <w:jc w:val="left"/>
       </w:pPr>
       <w:r>
-        <w:t xml:space="preserve">LI, J.; HUI, B.; QU, G. et al. Can LLM already serve as a database interface? A big bench for large-scale database grounded text-to-SQLs (BIRD). In: Advances in Neural Information Processing Systems (NeurIPS) – Datasets and Benchmarks Track, 2023. arXiv:2305.03111.</w:t>
+        <w:t xml:space="preserve">LEE, G.; HWANG, H.; BAE, S.; KWON, Y.; SHIN, W.; YANG, S.; SEO, M.; KIM, J.-Y.; CHOI, E. EHRSQL: a practical text-to-SQL benchmark for electronic health records. In: Advances in Neural Information Processing Systems (NeurIPS) – Datasets and Benchmarks Track, 2022. arXiv:2301.07695.</w:t>
       </w:r>
     </w:p>
     <w:p>
@@ -3246,7 +3246,37 @@
         <w:jc w:val="left"/>
       </w:pPr>
       <w:r>
+        <w:t xml:space="preserve">LI, J.; HUI, B.; QU, G. et al. Can LLM already serve as a database interface? A big bench for large-scale database grounded text-to-SQLs (BIRD). In: Advances in Neural Information Processing Systems (NeurIPS) – Datasets and Benchmarks Track, 2023. arXiv:2305.03111.</w:t>
+      </w:r>
+    </w:p>
+    <w:p>
+      <w:pPr>
+        <w:spacing w:after="120" w:line="360"/>
+        <w:ind w:left="480" w:hanging="480"/>
+        <w:jc w:val="left"/>
+      </w:pPr>
+      <w:r>
+        <w:t xml:space="preserve">NATIONAL INSTITUTE OF STANDARDS AND TECHNOLOGY (NIST). Artificial Intelligence Risk Management Framework (AI RMF 1.0). NIST AI 100-1. Gaithersburg, MD: NIST, 2023.</w:t>
+      </w:r>
+    </w:p>
+    <w:p>
+      <w:pPr>
+        <w:spacing w:after="120" w:line="360"/>
+        <w:ind w:left="480" w:hanging="480"/>
+        <w:jc w:val="left"/>
+      </w:pPr>
+      <w:r>
         <w:t xml:space="preserve">SHI, L.; TANG, Z.; ZHANG, N.; ZHANG, X.; YANG, Z. A survey on employing large language models for text-to-SQL tasks. ACM Computing Surveys, 2024. arXiv:2407.15186.</w:t>
+      </w:r>
+    </w:p>
+    <w:p>
+      <w:pPr>
+        <w:spacing w:after="120" w:line="360"/>
+        <w:ind w:left="480" w:hanging="480"/>
+        <w:jc w:val="left"/>
+      </w:pPr>
+      <w:r>
+        <w:t xml:space="preserve">SWEENEY, L. k-anonymity: a model for protecting privacy. International Journal of Uncertainty, Fuzziness and Knowledge-Based Systems, v. 10, n. 5, p. 557-570, 2002. DOI: 10.1142/S0218488502001648.</w:t>
       </w:r>
     </w:p>
     <w:p>
@@ -3277,10 +3307,71 @@
     <w:p>
       <w:pPr>
         <w:pStyle w:val="Heading1"/>
-        <w:spacing w:after="160" w:before="240"/>
-      </w:pPr>
-      <w:r>
-        <w:t xml:space="preserve">Apêndice A — Camadas da arquitetura</w:t>
+        <w:pageBreakBefore/>
+        <w:spacing w:after="160" w:before="120"/>
+      </w:pPr>
+      <w:r>
+        <w:t xml:space="preserve">Apêndice A — Arquitetura de referência em quatro camadas</w:t>
+      </w:r>
+    </w:p>
+    <w:p>
+      <w:pPr>
+        <w:spacing w:after="60"/>
+        <w:jc w:val="center"/>
+      </w:pPr>
+      <w:r>
+        <w:drawing>
+          <wp:inline distT="0" distB="0" distL="0" distR="0">
+            <wp:extent cx="4191000" cy="3400425"/>
+            <wp:effectExtent t="0" r="0" b="0" l="0"/>
+            <wp:docPr id="1" name="arquitetura_camadas" descr="Fluxo de uma pergunta pelas quatro camadas da arquitetura" title="Arquitetura em quatro camadas"/>
+            <wp:cNvGraphicFramePr>
+              <a:graphicFrameLocks xmlns:a="http://schemas.openxmlformats.org/drawingml/2006/main" noChangeAspect="1"/>
+            </wp:cNvGraphicFramePr>
+            <a:graphic xmlns:a="http://schemas.openxmlformats.org/drawingml/2006/main">
+              <a:graphicData uri="http://schemas.openxmlformats.org/drawingml/2006/picture">
+                <pic:pic xmlns:pic="http://schemas.openxmlformats.org/drawingml/2006/picture">
+                  <pic:nvPicPr>
+                    <pic:cNvPr id="0" name="" descr=""/>
+                    <pic:cNvPicPr>
+                      <a:picLocks noChangeAspect="1" noChangeArrowheads="1"/>
+                    </pic:cNvPicPr>
+                  </pic:nvPicPr>
+                  <pic:blipFill>
+                    <a:blip r:embed="rId7" cstate="none"/>
+                    <a:srcRect/>
+                    <a:stretch>
+                      <a:fillRect/>
+                    </a:stretch>
+                  </pic:blipFill>
+                  <pic:spPr bwMode="auto">
+                    <a:xfrm>
+                      <a:off x="0" y="0"/>
+                      <a:ext cx="4191000" cy="3400425"/>
+                    </a:xfrm>
+                    <a:prstGeom prst="rect">
+                      <a:avLst/>
+                    </a:prstGeom>
+                  </pic:spPr>
+                </pic:pic>
+              </a:graphicData>
+            </a:graphic>
+          </wp:inline>
+        </w:drawing>
+      </w:r>
+    </w:p>
+    <w:p>
+      <w:pPr>
+        <w:spacing w:after="160" w:before="60"/>
+      </w:pPr>
+      <w:r>
+        <w:rPr>
+          <w:i/>
+          <w:iCs/>
+          <w:sz w:val="20"/>
+          <w:szCs w:val="20"/>
+        </w:rPr>
+        <w:t xml:space="preserve">Figura A.1. Fluxo de uma pergunta pelas quatro camadas. Fonte: o autor.</w:t>
       </w:r>
     </w:p>
     <w:tbl>
@@ -3761,6 +3852,1119 @@
           <w:szCs w:val="20"/>
         </w:rPr>
         <w:t xml:space="preserve">Quadro A.1. Síntese das quatro camadas. Fonte: o autor.</w:t>
+      </w:r>
+    </w:p>
+    <w:p>
+      <w:pPr>
+        <w:pStyle w:val="Heading1"/>
+        <w:pageBreakBefore/>
+        <w:spacing w:after="160" w:before="120"/>
+      </w:pPr>
+      <w:r>
+        <w:t xml:space="preserve">Apêndice B — Requisitos regulatórios e controles</w:t>
+      </w:r>
+    </w:p>
+    <w:tbl>
+      <w:tblPr>
+        <w:tblW w:type="dxa" w:w="9071"/>
+        <w:tblBorders>
+          <w:top w:val="single" w:color="auto" w:sz="4"/>
+          <w:left w:val="single" w:color="auto" w:sz="4"/>
+          <w:bottom w:val="single" w:color="auto" w:sz="4"/>
+          <w:right w:val="single" w:color="auto" w:sz="4"/>
+          <w:insideH w:val="single" w:color="auto" w:sz="4"/>
+          <w:insideV w:val="single" w:color="auto" w:sz="4"/>
+        </w:tblBorders>
+      </w:tblPr>
+      <w:tblGrid>
+        <w:gridCol w:w="1740"/>
+        <w:gridCol w:w="5131"/>
+        <w:gridCol w:w="2200"/>
+      </w:tblGrid>
+      <w:tr>
+        <w:tc>
+          <w:tcPr>
+            <w:tcW w:type="dxa" w:w="1740"/>
+            <w:tcBorders>
+              <w:top w:val="single" w:color="999999" w:sz="1"/>
+              <w:left w:val="single" w:color="999999" w:sz="1"/>
+              <w:bottom w:val="single" w:color="999999" w:sz="1"/>
+              <w:right w:val="single" w:color="999999" w:sz="1"/>
+            </w:tcBorders>
+            <w:shd w:fill="D9E2F3" w:val="clear"/>
+            <w:tcMar>
+              <w:top w:type="dxa" w:w="60"/>
+              <w:left w:type="dxa" w:w="100"/>
+              <w:bottom w:type="dxa" w:w="60"/>
+              <w:right w:type="dxa" w:w="100"/>
+            </w:tcMar>
+          </w:tcPr>
+          <w:p>
+            <w:pPr>
+              <w:jc w:val="left"/>
+            </w:pPr>
+            <w:r>
+              <w:rPr>
+                <w:b/>
+                <w:bCs/>
+              </w:rPr>
+              <w:t xml:space="preserve">Requisito</w:t>
+            </w:r>
+          </w:p>
+        </w:tc>
+        <w:tc>
+          <w:tcPr>
+            <w:tcW w:type="dxa" w:w="5131"/>
+            <w:tcBorders>
+              <w:top w:val="single" w:color="999999" w:sz="1"/>
+              <w:left w:val="single" w:color="999999" w:sz="1"/>
+              <w:bottom w:val="single" w:color="999999" w:sz="1"/>
+              <w:right w:val="single" w:color="999999" w:sz="1"/>
+            </w:tcBorders>
+            <w:shd w:fill="D9E2F3" w:val="clear"/>
+            <w:tcMar>
+              <w:top w:type="dxa" w:w="60"/>
+              <w:left w:type="dxa" w:w="100"/>
+              <w:bottom w:type="dxa" w:w="60"/>
+              <w:right w:type="dxa" w:w="100"/>
+            </w:tcMar>
+          </w:tcPr>
+          <w:p>
+            <w:pPr>
+              <w:jc w:val="center"/>
+            </w:pPr>
+            <w:r>
+              <w:rPr>
+                <w:b/>
+                <w:bCs/>
+              </w:rPr>
+              <w:t xml:space="preserve">Controle na arquitetura</w:t>
+            </w:r>
+          </w:p>
+        </w:tc>
+        <w:tc>
+          <w:tcPr>
+            <w:tcW w:type="dxa" w:w="2200"/>
+            <w:tcBorders>
+              <w:top w:val="single" w:color="999999" w:sz="1"/>
+              <w:left w:val="single" w:color="999999" w:sz="1"/>
+              <w:bottom w:val="single" w:color="999999" w:sz="1"/>
+              <w:right w:val="single" w:color="999999" w:sz="1"/>
+            </w:tcBorders>
+            <w:shd w:fill="D9E2F3" w:val="clear"/>
+            <w:tcMar>
+              <w:top w:type="dxa" w:w="60"/>
+              <w:left w:type="dxa" w:w="100"/>
+              <w:bottom w:type="dxa" w:w="60"/>
+              <w:right w:type="dxa" w:w="100"/>
+            </w:tcMar>
+          </w:tcPr>
+          <w:p>
+            <w:pPr>
+              <w:jc w:val="center"/>
+            </w:pPr>
+            <w:r>
+              <w:rPr>
+                <w:b/>
+                <w:bCs/>
+              </w:rPr>
+              <w:t xml:space="preserve">Camada</w:t>
+            </w:r>
+          </w:p>
+        </w:tc>
+      </w:tr>
+      <w:tr>
+        <w:tc>
+          <w:tcPr>
+            <w:tcW w:type="dxa" w:w="1740"/>
+            <w:tcBorders>
+              <w:top w:val="single" w:color="999999" w:sz="1"/>
+              <w:left w:val="single" w:color="999999" w:sz="1"/>
+              <w:bottom w:val="single" w:color="999999" w:sz="1"/>
+              <w:right w:val="single" w:color="999999" w:sz="1"/>
+            </w:tcBorders>
+            <w:tcMar>
+              <w:top w:type="dxa" w:w="60"/>
+              <w:left w:type="dxa" w:w="100"/>
+              <w:bottom w:type="dxa" w:w="60"/>
+              <w:right w:type="dxa" w:w="100"/>
+            </w:tcMar>
+          </w:tcPr>
+          <w:p>
+            <w:pPr>
+              <w:jc w:val="left"/>
+            </w:pPr>
+            <w:r>
+              <w:rPr>
+                <w:b w:val="false"/>
+                <w:bCs w:val="false"/>
+              </w:rPr>
+              <w:t xml:space="preserve">REG-LGPD-001</w:t>
+            </w:r>
+          </w:p>
+        </w:tc>
+        <w:tc>
+          <w:tcPr>
+            <w:tcW w:type="dxa" w:w="5131"/>
+            <w:tcBorders>
+              <w:top w:val="single" w:color="999999" w:sz="1"/>
+              <w:left w:val="single" w:color="999999" w:sz="1"/>
+              <w:bottom w:val="single" w:color="999999" w:sz="1"/>
+              <w:right w:val="single" w:color="999999" w:sz="1"/>
+            </w:tcBorders>
+            <w:tcMar>
+              <w:top w:type="dxa" w:w="60"/>
+              <w:left w:type="dxa" w:w="100"/>
+              <w:bottom w:type="dxa" w:w="60"/>
+              <w:right w:type="dxa" w:w="100"/>
+            </w:tcMar>
+          </w:tcPr>
+          <w:p>
+            <w:pPr>
+              <w:jc w:val="center"/>
+            </w:pPr>
+            <w:r>
+              <w:rPr>
+                <w:b w:val="false"/>
+                <w:bCs w:val="false"/>
+              </w:rPr>
+              <w:t xml:space="preserve">Anonimização na Silver: remoção de nome, CPF e data de nascimento; derivação de faixa etária</w:t>
+            </w:r>
+          </w:p>
+        </w:tc>
+        <w:tc>
+          <w:tcPr>
+            <w:tcW w:type="dxa" w:w="2200"/>
+            <w:tcBorders>
+              <w:top w:val="single" w:color="999999" w:sz="1"/>
+              <w:left w:val="single" w:color="999999" w:sz="1"/>
+              <w:bottom w:val="single" w:color="999999" w:sz="1"/>
+              <w:right w:val="single" w:color="999999" w:sz="1"/>
+            </w:tcBorders>
+            <w:tcMar>
+              <w:top w:type="dxa" w:w="60"/>
+              <w:left w:type="dxa" w:w="100"/>
+              <w:bottom w:type="dxa" w:w="60"/>
+              <w:right w:type="dxa" w:w="100"/>
+            </w:tcMar>
+          </w:tcPr>
+          <w:p>
+            <w:pPr>
+              <w:jc w:val="center"/>
+            </w:pPr>
+            <w:r>
+              <w:rPr>
+                <w:b w:val="false"/>
+                <w:bCs w:val="false"/>
+              </w:rPr>
+              <w:t xml:space="preserve">Silver</w:t>
+            </w:r>
+          </w:p>
+        </w:tc>
+      </w:tr>
+      <w:tr>
+        <w:tc>
+          <w:tcPr>
+            <w:tcW w:type="dxa" w:w="1740"/>
+            <w:tcBorders>
+              <w:top w:val="single" w:color="999999" w:sz="1"/>
+              <w:left w:val="single" w:color="999999" w:sz="1"/>
+              <w:bottom w:val="single" w:color="999999" w:sz="1"/>
+              <w:right w:val="single" w:color="999999" w:sz="1"/>
+            </w:tcBorders>
+            <w:tcMar>
+              <w:top w:type="dxa" w:w="60"/>
+              <w:left w:type="dxa" w:w="100"/>
+              <w:bottom w:type="dxa" w:w="60"/>
+              <w:right w:type="dxa" w:w="100"/>
+            </w:tcMar>
+          </w:tcPr>
+          <w:p>
+            <w:pPr>
+              <w:jc w:val="left"/>
+            </w:pPr>
+            <w:r>
+              <w:rPr>
+                <w:b w:val="false"/>
+                <w:bCs w:val="false"/>
+              </w:rPr>
+              <w:t xml:space="preserve">REG-LGPD-002</w:t>
+            </w:r>
+          </w:p>
+        </w:tc>
+        <w:tc>
+          <w:tcPr>
+            <w:tcW w:type="dxa" w:w="5131"/>
+            <w:tcBorders>
+              <w:top w:val="single" w:color="999999" w:sz="1"/>
+              <w:left w:val="single" w:color="999999" w:sz="1"/>
+              <w:bottom w:val="single" w:color="999999" w:sz="1"/>
+              <w:right w:val="single" w:color="999999" w:sz="1"/>
+            </w:tcBorders>
+            <w:tcMar>
+              <w:top w:type="dxa" w:w="60"/>
+              <w:left w:type="dxa" w:w="100"/>
+              <w:bottom w:type="dxa" w:w="60"/>
+              <w:right w:type="dxa" w:w="100"/>
+            </w:tcMar>
+          </w:tcPr>
+          <w:p>
+            <w:pPr>
+              <w:jc w:val="center"/>
+            </w:pPr>
+            <w:r>
+              <w:rPr>
+                <w:b w:val="false"/>
+                <w:bCs w:val="false"/>
+              </w:rPr>
+              <w:t xml:space="preserve">Pseudonimização de id_paciente por hash; nenhuma identificação direta sobrevive à Silver</w:t>
+            </w:r>
+          </w:p>
+        </w:tc>
+        <w:tc>
+          <w:tcPr>
+            <w:tcW w:type="dxa" w:w="2200"/>
+            <w:tcBorders>
+              <w:top w:val="single" w:color="999999" w:sz="1"/>
+              <w:left w:val="single" w:color="999999" w:sz="1"/>
+              <w:bottom w:val="single" w:color="999999" w:sz="1"/>
+              <w:right w:val="single" w:color="999999" w:sz="1"/>
+            </w:tcBorders>
+            <w:tcMar>
+              <w:top w:type="dxa" w:w="60"/>
+              <w:left w:type="dxa" w:w="100"/>
+              <w:bottom w:type="dxa" w:w="60"/>
+              <w:right w:type="dxa" w:w="100"/>
+            </w:tcMar>
+          </w:tcPr>
+          <w:p>
+            <w:pPr>
+              <w:jc w:val="center"/>
+            </w:pPr>
+            <w:r>
+              <w:rPr>
+                <w:b w:val="false"/>
+                <w:bCs w:val="false"/>
+              </w:rPr>
+              <w:t xml:space="preserve">Silver</w:t>
+            </w:r>
+          </w:p>
+        </w:tc>
+      </w:tr>
+      <w:tr>
+        <w:tc>
+          <w:tcPr>
+            <w:tcW w:type="dxa" w:w="1740"/>
+            <w:tcBorders>
+              <w:top w:val="single" w:color="999999" w:sz="1"/>
+              <w:left w:val="single" w:color="999999" w:sz="1"/>
+              <w:bottom w:val="single" w:color="999999" w:sz="1"/>
+              <w:right w:val="single" w:color="999999" w:sz="1"/>
+            </w:tcBorders>
+            <w:tcMar>
+              <w:top w:type="dxa" w:w="60"/>
+              <w:left w:type="dxa" w:w="100"/>
+              <w:bottom w:type="dxa" w:w="60"/>
+              <w:right w:type="dxa" w:w="100"/>
+            </w:tcMar>
+          </w:tcPr>
+          <w:p>
+            <w:pPr>
+              <w:jc w:val="left"/>
+            </w:pPr>
+            <w:r>
+              <w:rPr>
+                <w:b w:val="false"/>
+                <w:bCs w:val="false"/>
+              </w:rPr>
+              <w:t xml:space="preserve">REG-LGPD-003</w:t>
+            </w:r>
+          </w:p>
+        </w:tc>
+        <w:tc>
+          <w:tcPr>
+            <w:tcW w:type="dxa" w:w="5131"/>
+            <w:tcBorders>
+              <w:top w:val="single" w:color="999999" w:sz="1"/>
+              <w:left w:val="single" w:color="999999" w:sz="1"/>
+              <w:bottom w:val="single" w:color="999999" w:sz="1"/>
+              <w:right w:val="single" w:color="999999" w:sz="1"/>
+            </w:tcBorders>
+            <w:tcMar>
+              <w:top w:type="dxa" w:w="60"/>
+              <w:left w:type="dxa" w:w="100"/>
+              <w:bottom w:type="dxa" w:w="60"/>
+              <w:right w:type="dxa" w:w="100"/>
+            </w:tcMar>
+          </w:tcPr>
+          <w:p>
+            <w:pPr>
+              <w:jc w:val="center"/>
+            </w:pPr>
+            <w:r>
+              <w:rPr>
+                <w:b w:val="false"/>
+                <w:bCs w:val="false"/>
+              </w:rPr>
+              <w:t xml:space="preserve">Apenas a Gold, agregada, é exposta ao motor; Bronze e Silver inacessíveis (CTRL-GOV-004)</w:t>
+            </w:r>
+          </w:p>
+        </w:tc>
+        <w:tc>
+          <w:tcPr>
+            <w:tcW w:type="dxa" w:w="2200"/>
+            <w:tcBorders>
+              <w:top w:val="single" w:color="999999" w:sz="1"/>
+              <w:left w:val="single" w:color="999999" w:sz="1"/>
+              <w:bottom w:val="single" w:color="999999" w:sz="1"/>
+              <w:right w:val="single" w:color="999999" w:sz="1"/>
+            </w:tcBorders>
+            <w:tcMar>
+              <w:top w:type="dxa" w:w="60"/>
+              <w:left w:type="dxa" w:w="100"/>
+              <w:bottom w:type="dxa" w:w="60"/>
+              <w:right w:type="dxa" w:w="100"/>
+            </w:tcMar>
+          </w:tcPr>
+          <w:p>
+            <w:pPr>
+              <w:jc w:val="center"/>
+            </w:pPr>
+            <w:r>
+              <w:rPr>
+                <w:b w:val="false"/>
+                <w:bCs w:val="false"/>
+              </w:rPr>
+              <w:t xml:space="preserve">Gold</w:t>
+            </w:r>
+          </w:p>
+        </w:tc>
+      </w:tr>
+      <w:tr>
+        <w:tc>
+          <w:tcPr>
+            <w:tcW w:type="dxa" w:w="1740"/>
+            <w:tcBorders>
+              <w:top w:val="single" w:color="999999" w:sz="1"/>
+              <w:left w:val="single" w:color="999999" w:sz="1"/>
+              <w:bottom w:val="single" w:color="999999" w:sz="1"/>
+              <w:right w:val="single" w:color="999999" w:sz="1"/>
+            </w:tcBorders>
+            <w:tcMar>
+              <w:top w:type="dxa" w:w="60"/>
+              <w:left w:type="dxa" w:w="100"/>
+              <w:bottom w:type="dxa" w:w="60"/>
+              <w:right w:type="dxa" w:w="100"/>
+            </w:tcMar>
+          </w:tcPr>
+          <w:p>
+            <w:pPr>
+              <w:jc w:val="left"/>
+            </w:pPr>
+            <w:r>
+              <w:rPr>
+                <w:b w:val="false"/>
+                <w:bCs w:val="false"/>
+              </w:rPr>
+              <w:t xml:space="preserve">REG-LGPD-004</w:t>
+            </w:r>
+          </w:p>
+        </w:tc>
+        <w:tc>
+          <w:tcPr>
+            <w:tcW w:type="dxa" w:w="5131"/>
+            <w:tcBorders>
+              <w:top w:val="single" w:color="999999" w:sz="1"/>
+              <w:left w:val="single" w:color="999999" w:sz="1"/>
+              <w:bottom w:val="single" w:color="999999" w:sz="1"/>
+              <w:right w:val="single" w:color="999999" w:sz="1"/>
+            </w:tcBorders>
+            <w:tcMar>
+              <w:top w:type="dxa" w:w="60"/>
+              <w:left w:type="dxa" w:w="100"/>
+              <w:bottom w:type="dxa" w:w="60"/>
+              <w:right w:type="dxa" w:w="100"/>
+            </w:tcMar>
+          </w:tcPr>
+          <w:p>
+            <w:pPr>
+              <w:jc w:val="center"/>
+            </w:pPr>
+            <w:r>
+              <w:rPr>
+                <w:b w:val="false"/>
+                <w:bCs w:val="false"/>
+              </w:rPr>
+              <w:t xml:space="preserve">Perfis autorizam apenas tabelas Gold específicas (CTRL-GOV-005)</w:t>
+            </w:r>
+          </w:p>
+        </w:tc>
+        <w:tc>
+          <w:tcPr>
+            <w:tcW w:type="dxa" w:w="2200"/>
+            <w:tcBorders>
+              <w:top w:val="single" w:color="999999" w:sz="1"/>
+              <w:left w:val="single" w:color="999999" w:sz="1"/>
+              <w:bottom w:val="single" w:color="999999" w:sz="1"/>
+              <w:right w:val="single" w:color="999999" w:sz="1"/>
+            </w:tcBorders>
+            <w:tcMar>
+              <w:top w:type="dxa" w:w="60"/>
+              <w:left w:type="dxa" w:w="100"/>
+              <w:bottom w:type="dxa" w:w="60"/>
+              <w:right w:type="dxa" w:w="100"/>
+            </w:tcMar>
+          </w:tcPr>
+          <w:p>
+            <w:pPr>
+              <w:jc w:val="center"/>
+            </w:pPr>
+            <w:r>
+              <w:rPr>
+                <w:b w:val="false"/>
+                <w:bCs w:val="false"/>
+              </w:rPr>
+              <w:t xml:space="preserve">Entrada</w:t>
+            </w:r>
+          </w:p>
+        </w:tc>
+      </w:tr>
+      <w:tr>
+        <w:tc>
+          <w:tcPr>
+            <w:tcW w:type="dxa" w:w="1740"/>
+            <w:tcBorders>
+              <w:top w:val="single" w:color="999999" w:sz="1"/>
+              <w:left w:val="single" w:color="999999" w:sz="1"/>
+              <w:bottom w:val="single" w:color="999999" w:sz="1"/>
+              <w:right w:val="single" w:color="999999" w:sz="1"/>
+            </w:tcBorders>
+            <w:tcMar>
+              <w:top w:type="dxa" w:w="60"/>
+              <w:left w:type="dxa" w:w="100"/>
+              <w:bottom w:type="dxa" w:w="60"/>
+              <w:right w:type="dxa" w:w="100"/>
+            </w:tcMar>
+          </w:tcPr>
+          <w:p>
+            <w:pPr>
+              <w:jc w:val="left"/>
+            </w:pPr>
+            <w:r>
+              <w:rPr>
+                <w:b w:val="false"/>
+                <w:bCs w:val="false"/>
+              </w:rPr>
+              <w:t xml:space="preserve">REG-LGPD-005</w:t>
+            </w:r>
+          </w:p>
+        </w:tc>
+        <w:tc>
+          <w:tcPr>
+            <w:tcW w:type="dxa" w:w="5131"/>
+            <w:tcBorders>
+              <w:top w:val="single" w:color="999999" w:sz="1"/>
+              <w:left w:val="single" w:color="999999" w:sz="1"/>
+              <w:bottom w:val="single" w:color="999999" w:sz="1"/>
+              <w:right w:val="single" w:color="999999" w:sz="1"/>
+            </w:tcBorders>
+            <w:tcMar>
+              <w:top w:type="dxa" w:w="60"/>
+              <w:left w:type="dxa" w:w="100"/>
+              <w:bottom w:type="dxa" w:w="60"/>
+              <w:right w:type="dxa" w:w="100"/>
+            </w:tcMar>
+          </w:tcPr>
+          <w:p>
+            <w:pPr>
+              <w:jc w:val="center"/>
+            </w:pPr>
+            <w:r>
+              <w:rPr>
+                <w:b w:val="false"/>
+                <w:bCs w:val="false"/>
+              </w:rPr>
+              <w:t xml:space="preserve">Guardrails CTRL-GOV-001 a 003 e 006: SQL única somente leitura, sem escrita/admin, conexão read-only</w:t>
+            </w:r>
+          </w:p>
+        </w:tc>
+        <w:tc>
+          <w:tcPr>
+            <w:tcW w:type="dxa" w:w="2200"/>
+            <w:tcBorders>
+              <w:top w:val="single" w:color="999999" w:sz="1"/>
+              <w:left w:val="single" w:color="999999" w:sz="1"/>
+              <w:bottom w:val="single" w:color="999999" w:sz="1"/>
+              <w:right w:val="single" w:color="999999" w:sz="1"/>
+            </w:tcBorders>
+            <w:tcMar>
+              <w:top w:type="dxa" w:w="60"/>
+              <w:left w:type="dxa" w:w="100"/>
+              <w:bottom w:type="dxa" w:w="60"/>
+              <w:right w:type="dxa" w:w="100"/>
+            </w:tcMar>
+          </w:tcPr>
+          <w:p>
+            <w:pPr>
+              <w:jc w:val="center"/>
+            </w:pPr>
+            <w:r>
+              <w:rPr>
+                <w:b w:val="false"/>
+                <w:bCs w:val="false"/>
+              </w:rPr>
+              <w:t xml:space="preserve">Entrada</w:t>
+            </w:r>
+          </w:p>
+        </w:tc>
+      </w:tr>
+      <w:tr>
+        <w:tc>
+          <w:tcPr>
+            <w:tcW w:type="dxa" w:w="1740"/>
+            <w:tcBorders>
+              <w:top w:val="single" w:color="999999" w:sz="1"/>
+              <w:left w:val="single" w:color="999999" w:sz="1"/>
+              <w:bottom w:val="single" w:color="999999" w:sz="1"/>
+              <w:right w:val="single" w:color="999999" w:sz="1"/>
+            </w:tcBorders>
+            <w:tcMar>
+              <w:top w:type="dxa" w:w="60"/>
+              <w:left w:type="dxa" w:w="100"/>
+              <w:bottom w:type="dxa" w:w="60"/>
+              <w:right w:type="dxa" w:w="100"/>
+            </w:tcMar>
+          </w:tcPr>
+          <w:p>
+            <w:pPr>
+              <w:jc w:val="left"/>
+            </w:pPr>
+            <w:r>
+              <w:rPr>
+                <w:b w:val="false"/>
+                <w:bCs w:val="false"/>
+              </w:rPr>
+              <w:t xml:space="preserve">REG-LGPD-006</w:t>
+            </w:r>
+          </w:p>
+        </w:tc>
+        <w:tc>
+          <w:tcPr>
+            <w:tcW w:type="dxa" w:w="5131"/>
+            <w:tcBorders>
+              <w:top w:val="single" w:color="999999" w:sz="1"/>
+              <w:left w:val="single" w:color="999999" w:sz="1"/>
+              <w:bottom w:val="single" w:color="999999" w:sz="1"/>
+              <w:right w:val="single" w:color="999999" w:sz="1"/>
+            </w:tcBorders>
+            <w:tcMar>
+              <w:top w:type="dxa" w:w="60"/>
+              <w:left w:type="dxa" w:w="100"/>
+              <w:bottom w:type="dxa" w:w="60"/>
+              <w:right w:type="dxa" w:w="100"/>
+            </w:tcMar>
+          </w:tcPr>
+          <w:p>
+            <w:pPr>
+              <w:jc w:val="center"/>
+            </w:pPr>
+            <w:r>
+              <w:rPr>
+                <w:b w:val="false"/>
+                <w:bCs w:val="false"/>
+              </w:rPr>
+              <w:t xml:space="preserve">Filtro de saída CTRL-VALID-002: bloqueia coluna com nome de campo sensível</w:t>
+            </w:r>
+          </w:p>
+        </w:tc>
+        <w:tc>
+          <w:tcPr>
+            <w:tcW w:type="dxa" w:w="2200"/>
+            <w:tcBorders>
+              <w:top w:val="single" w:color="999999" w:sz="1"/>
+              <w:left w:val="single" w:color="999999" w:sz="1"/>
+              <w:bottom w:val="single" w:color="999999" w:sz="1"/>
+              <w:right w:val="single" w:color="999999" w:sz="1"/>
+            </w:tcBorders>
+            <w:tcMar>
+              <w:top w:type="dxa" w:w="60"/>
+              <w:left w:type="dxa" w:w="100"/>
+              <w:bottom w:type="dxa" w:w="60"/>
+              <w:right w:type="dxa" w:w="100"/>
+            </w:tcMar>
+          </w:tcPr>
+          <w:p>
+            <w:pPr>
+              <w:jc w:val="center"/>
+            </w:pPr>
+            <w:r>
+              <w:rPr>
+                <w:b w:val="false"/>
+                <w:bCs w:val="false"/>
+              </w:rPr>
+              <w:t xml:space="preserve">Saída</w:t>
+            </w:r>
+          </w:p>
+        </w:tc>
+      </w:tr>
+      <w:tr>
+        <w:tc>
+          <w:tcPr>
+            <w:tcW w:type="dxa" w:w="1740"/>
+            <w:tcBorders>
+              <w:top w:val="single" w:color="999999" w:sz="1"/>
+              <w:left w:val="single" w:color="999999" w:sz="1"/>
+              <w:bottom w:val="single" w:color="999999" w:sz="1"/>
+              <w:right w:val="single" w:color="999999" w:sz="1"/>
+            </w:tcBorders>
+            <w:tcMar>
+              <w:top w:type="dxa" w:w="60"/>
+              <w:left w:type="dxa" w:w="100"/>
+              <w:bottom w:type="dxa" w:w="60"/>
+              <w:right w:type="dxa" w:w="100"/>
+            </w:tcMar>
+          </w:tcPr>
+          <w:p>
+            <w:pPr>
+              <w:jc w:val="left"/>
+            </w:pPr>
+            <w:r>
+              <w:rPr>
+                <w:b w:val="false"/>
+                <w:bCs w:val="false"/>
+              </w:rPr>
+              <w:t xml:space="preserve">REG-LGPD-007</w:t>
+            </w:r>
+          </w:p>
+        </w:tc>
+        <w:tc>
+          <w:tcPr>
+            <w:tcW w:type="dxa" w:w="5131"/>
+            <w:tcBorders>
+              <w:top w:val="single" w:color="999999" w:sz="1"/>
+              <w:left w:val="single" w:color="999999" w:sz="1"/>
+              <w:bottom w:val="single" w:color="999999" w:sz="1"/>
+              <w:right w:val="single" w:color="999999" w:sz="1"/>
+            </w:tcBorders>
+            <w:tcMar>
+              <w:top w:type="dxa" w:w="60"/>
+              <w:left w:type="dxa" w:w="100"/>
+              <w:bottom w:type="dxa" w:w="60"/>
+              <w:right w:type="dxa" w:w="100"/>
+            </w:tcMar>
+          </w:tcPr>
+          <w:p>
+            <w:pPr>
+              <w:jc w:val="center"/>
+            </w:pPr>
+            <w:r>
+              <w:rPr>
+                <w:b w:val="false"/>
+                <w:bCs w:val="false"/>
+              </w:rPr>
+              <w:t xml:space="preserve">Auditoria CTRL-AUD-001: registro de toda pergunta e resposta</w:t>
+            </w:r>
+          </w:p>
+        </w:tc>
+        <w:tc>
+          <w:tcPr>
+            <w:tcW w:type="dxa" w:w="2200"/>
+            <w:tcBorders>
+              <w:top w:val="single" w:color="999999" w:sz="1"/>
+              <w:left w:val="single" w:color="999999" w:sz="1"/>
+              <w:bottom w:val="single" w:color="999999" w:sz="1"/>
+              <w:right w:val="single" w:color="999999" w:sz="1"/>
+            </w:tcBorders>
+            <w:tcMar>
+              <w:top w:type="dxa" w:w="60"/>
+              <w:left w:type="dxa" w:w="100"/>
+              <w:bottom w:type="dxa" w:w="60"/>
+              <w:right w:type="dxa" w:w="100"/>
+            </w:tcMar>
+          </w:tcPr>
+          <w:p>
+            <w:pPr>
+              <w:jc w:val="center"/>
+            </w:pPr>
+            <w:r>
+              <w:rPr>
+                <w:b w:val="false"/>
+                <w:bCs w:val="false"/>
+              </w:rPr>
+              <w:t xml:space="preserve">Auditoria</w:t>
+            </w:r>
+          </w:p>
+        </w:tc>
+      </w:tr>
+      <w:tr>
+        <w:tc>
+          <w:tcPr>
+            <w:tcW w:type="dxa" w:w="1740"/>
+            <w:tcBorders>
+              <w:top w:val="single" w:color="999999" w:sz="1"/>
+              <w:left w:val="single" w:color="999999" w:sz="1"/>
+              <w:bottom w:val="single" w:color="999999" w:sz="1"/>
+              <w:right w:val="single" w:color="999999" w:sz="1"/>
+            </w:tcBorders>
+            <w:tcMar>
+              <w:top w:type="dxa" w:w="60"/>
+              <w:left w:type="dxa" w:w="100"/>
+              <w:bottom w:type="dxa" w:w="60"/>
+              <w:right w:type="dxa" w:w="100"/>
+            </w:tcMar>
+          </w:tcPr>
+          <w:p>
+            <w:pPr>
+              <w:jc w:val="left"/>
+            </w:pPr>
+            <w:r>
+              <w:rPr>
+                <w:b w:val="false"/>
+                <w:bCs w:val="false"/>
+              </w:rPr>
+              <w:t xml:space="preserve">REG-ANPD-001</w:t>
+            </w:r>
+          </w:p>
+        </w:tc>
+        <w:tc>
+          <w:tcPr>
+            <w:tcW w:type="dxa" w:w="5131"/>
+            <w:tcBorders>
+              <w:top w:val="single" w:color="999999" w:sz="1"/>
+              <w:left w:val="single" w:color="999999" w:sz="1"/>
+              <w:bottom w:val="single" w:color="999999" w:sz="1"/>
+              <w:right w:val="single" w:color="999999" w:sz="1"/>
+            </w:tcBorders>
+            <w:tcMar>
+              <w:top w:type="dxa" w:w="60"/>
+              <w:left w:type="dxa" w:w="100"/>
+              <w:bottom w:type="dxa" w:w="60"/>
+              <w:right w:type="dxa" w:w="100"/>
+            </w:tcMar>
+          </w:tcPr>
+          <w:p>
+            <w:pPr>
+              <w:jc w:val="center"/>
+            </w:pPr>
+            <w:r>
+              <w:rPr>
+                <w:b w:val="false"/>
+                <w:bCs w:val="false"/>
+              </w:rPr>
+              <w:t xml:space="preserve">Aterramento CTRL-VALID-001: toda tabela citada deve existir no schema Gold conhecido</w:t>
+            </w:r>
+          </w:p>
+        </w:tc>
+        <w:tc>
+          <w:tcPr>
+            <w:tcW w:type="dxa" w:w="2200"/>
+            <w:tcBorders>
+              <w:top w:val="single" w:color="999999" w:sz="1"/>
+              <w:left w:val="single" w:color="999999" w:sz="1"/>
+              <w:bottom w:val="single" w:color="999999" w:sz="1"/>
+              <w:right w:val="single" w:color="999999" w:sz="1"/>
+            </w:tcBorders>
+            <w:tcMar>
+              <w:top w:type="dxa" w:w="60"/>
+              <w:left w:type="dxa" w:w="100"/>
+              <w:bottom w:type="dxa" w:w="60"/>
+              <w:right w:type="dxa" w:w="100"/>
+            </w:tcMar>
+          </w:tcPr>
+          <w:p>
+            <w:pPr>
+              <w:jc w:val="center"/>
+            </w:pPr>
+            <w:r>
+              <w:rPr>
+                <w:b w:val="false"/>
+                <w:bCs w:val="false"/>
+              </w:rPr>
+              <w:t xml:space="preserve">Saída</w:t>
+            </w:r>
+          </w:p>
+        </w:tc>
+      </w:tr>
+      <w:tr>
+        <w:tc>
+          <w:tcPr>
+            <w:tcW w:type="dxa" w:w="1740"/>
+            <w:tcBorders>
+              <w:top w:val="single" w:color="999999" w:sz="1"/>
+              <w:left w:val="single" w:color="999999" w:sz="1"/>
+              <w:bottom w:val="single" w:color="999999" w:sz="1"/>
+              <w:right w:val="single" w:color="999999" w:sz="1"/>
+            </w:tcBorders>
+            <w:tcMar>
+              <w:top w:type="dxa" w:w="60"/>
+              <w:left w:type="dxa" w:w="100"/>
+              <w:bottom w:type="dxa" w:w="60"/>
+              <w:right w:type="dxa" w:w="100"/>
+            </w:tcMar>
+          </w:tcPr>
+          <w:p>
+            <w:pPr>
+              <w:jc w:val="left"/>
+            </w:pPr>
+            <w:r>
+              <w:rPr>
+                <w:b w:val="false"/>
+                <w:bCs w:val="false"/>
+              </w:rPr>
+              <w:t xml:space="preserve">REG-ANPD-002</w:t>
+            </w:r>
+          </w:p>
+        </w:tc>
+        <w:tc>
+          <w:tcPr>
+            <w:tcW w:type="dxa" w:w="5131"/>
+            <w:tcBorders>
+              <w:top w:val="single" w:color="999999" w:sz="1"/>
+              <w:left w:val="single" w:color="999999" w:sz="1"/>
+              <w:bottom w:val="single" w:color="999999" w:sz="1"/>
+              <w:right w:val="single" w:color="999999" w:sz="1"/>
+            </w:tcBorders>
+            <w:tcMar>
+              <w:top w:type="dxa" w:w="60"/>
+              <w:left w:type="dxa" w:w="100"/>
+              <w:bottom w:type="dxa" w:w="60"/>
+              <w:right w:type="dxa" w:w="100"/>
+            </w:tcMar>
+          </w:tcPr>
+          <w:p>
+            <w:pPr>
+              <w:jc w:val="center"/>
+            </w:pPr>
+            <w:r>
+              <w:rPr>
+                <w:b w:val="false"/>
+                <w:bCs w:val="false"/>
+              </w:rPr>
+              <w:t xml:space="preserve">Escopo restrito por perfil, execução somente leitura e registro integral</w:t>
+            </w:r>
+          </w:p>
+        </w:tc>
+        <w:tc>
+          <w:tcPr>
+            <w:tcW w:type="dxa" w:w="2200"/>
+            <w:tcBorders>
+              <w:top w:val="single" w:color="999999" w:sz="1"/>
+              <w:left w:val="single" w:color="999999" w:sz="1"/>
+              <w:bottom w:val="single" w:color="999999" w:sz="1"/>
+              <w:right w:val="single" w:color="999999" w:sz="1"/>
+            </w:tcBorders>
+            <w:tcMar>
+              <w:top w:type="dxa" w:w="60"/>
+              <w:left w:type="dxa" w:w="100"/>
+              <w:bottom w:type="dxa" w:w="60"/>
+              <w:right w:type="dxa" w:w="100"/>
+            </w:tcMar>
+          </w:tcPr>
+          <w:p>
+            <w:pPr>
+              <w:jc w:val="center"/>
+            </w:pPr>
+            <w:r>
+              <w:rPr>
+                <w:b w:val="false"/>
+                <w:bCs w:val="false"/>
+              </w:rPr>
+              <w:t xml:space="preserve">Entrada e Auditoria</w:t>
+            </w:r>
+          </w:p>
+        </w:tc>
+      </w:tr>
+      <w:tr>
+        <w:tc>
+          <w:tcPr>
+            <w:tcW w:type="dxa" w:w="1740"/>
+            <w:tcBorders>
+              <w:top w:val="single" w:color="999999" w:sz="1"/>
+              <w:left w:val="single" w:color="999999" w:sz="1"/>
+              <w:bottom w:val="single" w:color="999999" w:sz="1"/>
+              <w:right w:val="single" w:color="999999" w:sz="1"/>
+            </w:tcBorders>
+            <w:tcMar>
+              <w:top w:type="dxa" w:w="60"/>
+              <w:left w:type="dxa" w:w="100"/>
+              <w:bottom w:type="dxa" w:w="60"/>
+              <w:right w:type="dxa" w:w="100"/>
+            </w:tcMar>
+          </w:tcPr>
+          <w:p>
+            <w:pPr>
+              <w:jc w:val="left"/>
+            </w:pPr>
+            <w:r>
+              <w:rPr>
+                <w:b w:val="false"/>
+                <w:bCs w:val="false"/>
+              </w:rPr>
+              <w:t xml:space="preserve">REG-ANVISA-001</w:t>
+            </w:r>
+          </w:p>
+        </w:tc>
+        <w:tc>
+          <w:tcPr>
+            <w:tcW w:type="dxa" w:w="5131"/>
+            <w:tcBorders>
+              <w:top w:val="single" w:color="999999" w:sz="1"/>
+              <w:left w:val="single" w:color="999999" w:sz="1"/>
+              <w:bottom w:val="single" w:color="999999" w:sz="1"/>
+              <w:right w:val="single" w:color="999999" w:sz="1"/>
+            </w:tcBorders>
+            <w:tcMar>
+              <w:top w:type="dxa" w:w="60"/>
+              <w:left w:type="dxa" w:w="100"/>
+              <w:bottom w:type="dxa" w:w="60"/>
+              <w:right w:type="dxa" w:w="100"/>
+            </w:tcMar>
+          </w:tcPr>
+          <w:p>
+            <w:pPr>
+              <w:jc w:val="center"/>
+            </w:pPr>
+            <w:r>
+              <w:rPr>
+                <w:b w:val="false"/>
+                <w:bCs w:val="false"/>
+              </w:rPr>
+              <w:t xml:space="preserve">Guardrails versionados, auditoria e reprodutibilidade do software</w:t>
+            </w:r>
+          </w:p>
+        </w:tc>
+        <w:tc>
+          <w:tcPr>
+            <w:tcW w:type="dxa" w:w="2200"/>
+            <w:tcBorders>
+              <w:top w:val="single" w:color="999999" w:sz="1"/>
+              <w:left w:val="single" w:color="999999" w:sz="1"/>
+              <w:bottom w:val="single" w:color="999999" w:sz="1"/>
+              <w:right w:val="single" w:color="999999" w:sz="1"/>
+            </w:tcBorders>
+            <w:tcMar>
+              <w:top w:type="dxa" w:w="60"/>
+              <w:left w:type="dxa" w:w="100"/>
+              <w:bottom w:type="dxa" w:w="60"/>
+              <w:right w:type="dxa" w:w="100"/>
+            </w:tcMar>
+          </w:tcPr>
+          <w:p>
+            <w:pPr>
+              <w:jc w:val="center"/>
+            </w:pPr>
+            <w:r>
+              <w:rPr>
+                <w:b w:val="false"/>
+                <w:bCs w:val="false"/>
+              </w:rPr>
+              <w:t xml:space="preserve">Transversal</w:t>
+            </w:r>
+          </w:p>
+        </w:tc>
+      </w:tr>
+      <w:tr>
+        <w:tc>
+          <w:tcPr>
+            <w:tcW w:type="dxa" w:w="1740"/>
+            <w:tcBorders>
+              <w:top w:val="single" w:color="999999" w:sz="1"/>
+              <w:left w:val="single" w:color="999999" w:sz="1"/>
+              <w:bottom w:val="single" w:color="999999" w:sz="1"/>
+              <w:right w:val="single" w:color="999999" w:sz="1"/>
+            </w:tcBorders>
+            <w:tcMar>
+              <w:top w:type="dxa" w:w="60"/>
+              <w:left w:type="dxa" w:w="100"/>
+              <w:bottom w:type="dxa" w:w="60"/>
+              <w:right w:type="dxa" w:w="100"/>
+            </w:tcMar>
+          </w:tcPr>
+          <w:p>
+            <w:pPr>
+              <w:jc w:val="left"/>
+            </w:pPr>
+            <w:r>
+              <w:rPr>
+                <w:b w:val="false"/>
+                <w:bCs w:val="false"/>
+              </w:rPr>
+              <w:t xml:space="preserve">REG-PESQ-001</w:t>
+            </w:r>
+          </w:p>
+        </w:tc>
+        <w:tc>
+          <w:tcPr>
+            <w:tcW w:type="dxa" w:w="5131"/>
+            <w:tcBorders>
+              <w:top w:val="single" w:color="999999" w:sz="1"/>
+              <w:left w:val="single" w:color="999999" w:sz="1"/>
+              <w:bottom w:val="single" w:color="999999" w:sz="1"/>
+              <w:right w:val="single" w:color="999999" w:sz="1"/>
+            </w:tcBorders>
+            <w:tcMar>
+              <w:top w:type="dxa" w:w="60"/>
+              <w:left w:type="dxa" w:w="100"/>
+              <w:bottom w:type="dxa" w:w="60"/>
+              <w:right w:type="dxa" w:w="100"/>
+            </w:tcMar>
+          </w:tcPr>
+          <w:p>
+            <w:pPr>
+              <w:jc w:val="center"/>
+            </w:pPr>
+            <w:r>
+              <w:rPr>
+                <w:b w:val="false"/>
+                <w:bCs w:val="false"/>
+              </w:rPr>
+              <w:t xml:space="preserve">Determinismo (SEED, SIM_TODAY); separação motor LLM (números) vs oráculo (autoteste)</w:t>
+            </w:r>
+          </w:p>
+        </w:tc>
+        <w:tc>
+          <w:tcPr>
+            <w:tcW w:type="dxa" w:w="2200"/>
+            <w:tcBorders>
+              <w:top w:val="single" w:color="999999" w:sz="1"/>
+              <w:left w:val="single" w:color="999999" w:sz="1"/>
+              <w:bottom w:val="single" w:color="999999" w:sz="1"/>
+              <w:right w:val="single" w:color="999999" w:sz="1"/>
+            </w:tcBorders>
+            <w:tcMar>
+              <w:top w:type="dxa" w:w="60"/>
+              <w:left w:type="dxa" w:w="100"/>
+              <w:bottom w:type="dxa" w:w="60"/>
+              <w:right w:type="dxa" w:w="100"/>
+            </w:tcMar>
+          </w:tcPr>
+          <w:p>
+            <w:pPr>
+              <w:jc w:val="center"/>
+            </w:pPr>
+            <w:r>
+              <w:rPr>
+                <w:b w:val="false"/>
+                <w:bCs w:val="false"/>
+              </w:rPr>
+              <w:t xml:space="preserve">Transversal</w:t>
+            </w:r>
+          </w:p>
+        </w:tc>
+      </w:tr>
+    </w:tbl>
+    <w:p>
+      <w:pPr>
+        <w:spacing w:after="160" w:before="60"/>
+      </w:pPr>
+      <w:r>
+        <w:rPr>
+          <w:i/>
+          <w:iCs/>
+          <w:sz w:val="20"/>
+          <w:szCs w:val="20"/>
+        </w:rPr>
+        <w:t xml:space="preserve">Quadro B.1. Mapeamento de requisitos regulatórios para controles e camadas. Fonte: o autor.</w:t>
       </w:r>
     </w:p>
     <w:p>

</xml_diff>

<commit_message>
docs: finaliza o documento (remove notas de rascunho e formata referencias) (#26)
- Remove as duas notas de rodape de rascunho (Referencias e Apendice B).
- Formata as 10 referencias no padrao ABNT com "Disponivel em: <URL>. Acesso
  em: 10 jun. 2026", usando URLs reais e verificadas (Planalto/LGPD,
  gov.br/ANPD, AnvisaLegis/RDC 657, arXiv, DOI, NIST).

Data de acesso preenchida (autorizada pelo autor); nenhuma URL inventada.
Documento validado (validate.py); 11 paginas.

Closes #25
</commit_message>
<xml_diff>
--- a/docs/tcc/Resultados_Preliminares_TCC.docx
+++ b/docs/tcc/Resultados_Preliminares_TCC.docx
@@ -3196,7 +3196,7 @@
         <w:jc w:val="left"/>
       </w:pPr>
       <w:r>
-        <w:t xml:space="preserve">AFFOLTER, K.; STOCKINGER, K.; BERNSTEIN, A. A comparative survey of recent natural language interfaces for databases. The VLDB Journal, v. 28, n. 5, p. 793-819, 2019. DOI: 10.1007/s00778-019-00567-8.</w:t>
+        <w:t xml:space="preserve">AFFOLTER, K.; STOCKINGER, K.; BERNSTEIN, A. A comparative survey of recent natural language interfaces for databases. The VLDB Journal, v. 28, n. 5, p. 793-819, 2019. DOI: 10.1007/s00778-019-00567-8. Disponível em: https://doi.org/10.1007/s00778-019-00567-8. Acesso em: 10 jun. 2026.</w:t>
       </w:r>
     </w:p>
     <w:p>
@@ -3206,7 +3206,7 @@
         <w:jc w:val="left"/>
       </w:pPr>
       <w:r>
-        <w:t xml:space="preserve">AGÊNCIA NACIONAL DE VIGILÂNCIA SANITÁRIA (ANVISA). Resolução da Diretoria Colegiada – RDC nº 657, de 24 de março de 2022. Dispõe sobre a regularização de software como dispositivo médico (Software as a Medical Device – SaMD). Brasília, DF: Anvisa, 2022.</w:t>
+        <w:t xml:space="preserve">AGÊNCIA NACIONAL DE VIGILÂNCIA SANITÁRIA (ANVISA). Resolução da Diretoria Colegiada – RDC nº 657, de 24 de março de 2022. Dispõe sobre a regularização de software como dispositivo médico (Software as a Medical Device – SaMD). Brasília, DF: Anvisa, 2022. Disponível em: https://anvisalegis.datalegis.net/action/ActionDatalegis.php?acao=abrirTextoAto&amp;tipo=RDC&amp;numeroAto=00000657&amp;seqAto=000&amp;valorAno=2022&amp;orgao=RDC/DC/ANVISA/MS. Acesso em: 10 jun. 2026.</w:t>
       </w:r>
     </w:p>
     <w:p>
@@ -3216,7 +3216,7 @@
         <w:jc w:val="left"/>
       </w:pPr>
       <w:r>
-        <w:t xml:space="preserve">AUTORIDADE NACIONAL DE PROTEÇÃO DE DADOS (ANPD). Radar tecnológico: inteligência artificial generativa. Brasília, DF: ANPD, 2024.</w:t>
+        <w:t xml:space="preserve">AUTORIDADE NACIONAL DE PROTEÇÃO DE DADOS (ANPD). Radar tecnológico: inteligência artificial generativa. Brasília, DF: ANPD, 2024. Disponível em: https://www.gov.br/anpd/pt-br/documentos-e-publicacoes/documentos-de-publicacoes/radar_tecnologico_ia_generativa_anpd.pdf. Acesso em: 10 jun. 2026.</w:t>
       </w:r>
     </w:p>
     <w:p>
@@ -3226,7 +3226,7 @@
         <w:jc w:val="left"/>
       </w:pPr>
       <w:r>
-        <w:t xml:space="preserve">BRASIL. Lei nº 13.709, de 14 de agosto de 2018. Lei Geral de Proteção de Dados Pessoais (LGPD). Brasília, DF: Presidência da República, 2018.</w:t>
+        <w:t xml:space="preserve">BRASIL. Lei nº 13.709, de 14 de agosto de 2018. Lei Geral de Proteção de Dados Pessoais (LGPD). Brasília, DF: Presidência da República, 2018. Disponível em: https://www.planalto.gov.br/ccivil_03/_ato2015-2018/2018/lei/l13709.htm. Acesso em: 10 jun. 2026.</w:t>
       </w:r>
     </w:p>
     <w:p>
@@ -3236,7 +3236,7 @@
         <w:jc w:val="left"/>
       </w:pPr>
       <w:r>
-        <w:t xml:space="preserve">LEE, G.; HWANG, H.; BAE, S.; KWON, Y.; SHIN, W.; YANG, S.; SEO, M.; KIM, J.-Y.; CHOI, E. EHRSQL: a practical text-to-SQL benchmark for electronic health records. In: Advances in Neural Information Processing Systems (NeurIPS) – Datasets and Benchmarks Track, 2022. arXiv:2301.07695.</w:t>
+        <w:t xml:space="preserve">LEE, G.; HWANG, H.; BAE, S.; KWON, Y.; SHIN, W.; YANG, S.; SEO, M.; KIM, J.-Y.; CHOI, E. EHRSQL: a practical text-to-SQL benchmark for electronic health records. In: Advances in Neural Information Processing Systems (NeurIPS) – Datasets and Benchmarks Track, 2022. Disponível em: https://arxiv.org/abs/2301.07695. Acesso em: 10 jun. 2026.</w:t>
       </w:r>
     </w:p>
     <w:p>
@@ -3246,7 +3246,7 @@
         <w:jc w:val="left"/>
       </w:pPr>
       <w:r>
-        <w:t xml:space="preserve">LI, J.; HUI, B.; QU, G. et al. Can LLM already serve as a database interface? A big bench for large-scale database grounded text-to-SQLs (BIRD). In: Advances in Neural Information Processing Systems (NeurIPS) – Datasets and Benchmarks Track, 2023. arXiv:2305.03111.</w:t>
+        <w:t xml:space="preserve">LI, J.; HUI, B.; QU, G. et al. Can LLM already serve as a database interface? A big bench for large-scale database grounded text-to-SQLs (BIRD). In: Advances in Neural Information Processing Systems (NeurIPS) – Datasets and Benchmarks Track, 2023. Disponível em: https://arxiv.org/abs/2305.03111. Acesso em: 10 jun. 2026.</w:t>
       </w:r>
     </w:p>
     <w:p>
@@ -3256,7 +3256,7 @@
         <w:jc w:val="left"/>
       </w:pPr>
       <w:r>
-        <w:t xml:space="preserve">NATIONAL INSTITUTE OF STANDARDS AND TECHNOLOGY (NIST). Artificial Intelligence Risk Management Framework (AI RMF 1.0). NIST AI 100-1. Gaithersburg, MD: NIST, 2023.</w:t>
+        <w:t xml:space="preserve">NATIONAL INSTITUTE OF STANDARDS AND TECHNOLOGY (NIST). Artificial Intelligence Risk Management Framework (AI RMF 1.0). NIST AI 100-1. Gaithersburg, MD: NIST, 2023. Disponível em: https://nvlpubs.nist.gov/nistpubs/ai/nist.ai.100-1.pdf. Acesso em: 10 jun. 2026.</w:t>
       </w:r>
     </w:p>
     <w:p>
@@ -3266,7 +3266,7 @@
         <w:jc w:val="left"/>
       </w:pPr>
       <w:r>
-        <w:t xml:space="preserve">SHI, L.; TANG, Z.; ZHANG, N.; ZHANG, X.; YANG, Z. A survey on employing large language models for text-to-SQL tasks. ACM Computing Surveys, 2024. arXiv:2407.15186.</w:t>
+        <w:t xml:space="preserve">SHI, L.; TANG, Z.; ZHANG, N.; ZHANG, X.; YANG, Z. A survey on employing large language models for text-to-SQL tasks. ACM Computing Surveys, 2024. Disponível em: https://arxiv.org/abs/2407.15186. Acesso em: 10 jun. 2026.</w:t>
       </w:r>
     </w:p>
     <w:p>
@@ -3276,7 +3276,7 @@
         <w:jc w:val="left"/>
       </w:pPr>
       <w:r>
-        <w:t xml:space="preserve">SWEENEY, L. k-anonymity: a model for protecting privacy. International Journal of Uncertainty, Fuzziness and Knowledge-Based Systems, v. 10, n. 5, p. 557-570, 2002. DOI: 10.1142/S0218488502001648.</w:t>
+        <w:t xml:space="preserve">SWEENEY, L. k-anonymity: a model for protecting privacy. International Journal of Uncertainty, Fuzziness and Knowledge-Based Systems, v. 10, n. 5, p. 557-570, 2002. DOI: 10.1142/S0218488502001648. Disponível em: https://doi.org/10.1142/S0218488502001648. Acesso em: 10 jun. 2026.</w:t>
       </w:r>
     </w:p>
     <w:p>
@@ -3286,22 +3286,7 @@
         <w:jc w:val="left"/>
       </w:pPr>
       <w:r>
-        <w:t xml:space="preserve">YU, T.; ZHANG, R.; YANG, K.; YASUNAGA, M.; WANG, D.; LI, Z.; MA, J.; LI, I.; YAO, Q.; ROMAN, S.; ZHANG, Z.; RADEV, D. Spider: a large-scale human-labeled dataset for complex and cross-domain semantic parsing and text-to-SQL task. In: Proceedings of the 2018 Conference on Empirical Methods in Natural Language Processing (EMNLP), 2018. arXiv:1809.08887.</w:t>
-      </w:r>
-    </w:p>
-    <w:p>
-      <w:pPr>
-        <w:spacing w:before="120"/>
-      </w:pPr>
-      <w:r>
-        <w:rPr>
-          <w:i/>
-          <w:iCs/>
-          <w:color w:val="777777"/>
-          <w:sz w:val="18"/>
-          <w:szCs w:val="18"/>
-        </w:rPr>
-        <w:t xml:space="preserve">Nota (remover antes do depósito): referências reais, verificadas, propostas para os temas do trabalho. Confirme que foram efetivamente consultadas, ajuste à formatação ABNT da USP/Esalq (data de acesso, DOI/URL) e acrescente as demais obras da sua revisão de literatura.</w:t>
+        <w:t xml:space="preserve">YU, T.; ZHANG, R.; YANG, K.; YASUNAGA, M.; WANG, D.; LI, Z.; MA, J.; LI, I.; YAO, Q.; ROMAN, S.; ZHANG, Z.; RADEV, D. Spider: a large-scale human-labeled dataset for complex and cross-domain semantic parsing and text-to-SQL task. In: Proceedings of the 2018 Conference on Empirical Methods in Natural Language Processing (EMNLP), 2018. Disponível em: https://arxiv.org/abs/1809.08887. Acesso em: 10 jun. 2026.</w:t>
       </w:r>
     </w:p>
     <w:p>
@@ -4965,21 +4950,6 @@
           <w:szCs w:val="20"/>
         </w:rPr>
         <w:t xml:space="preserve">Quadro B.1. Mapeamento de requisitos regulatórios para controles e camadas. Fonte: o autor.</w:t>
-      </w:r>
-    </w:p>
-    <w:p>
-      <w:pPr>
-        <w:spacing w:before="240"/>
-      </w:pPr>
-      <w:r>
-        <w:rPr>
-          <w:i/>
-          <w:iCs/>
-          <w:color w:val="777777"/>
-          <w:sz w:val="18"/>
-          <w:szCs w:val="18"/>
-        </w:rPr>
-        <w:t xml:space="preserve">Nota (remover antes do depósito): documento de apoio gerado a partir da documentação do protótipo (RES-001 a RES-007). Capa, objetivos e referências já preenchidos; confira a formatação ABNT da USP/Esalq e acrescente as demais obras da revisão de literatura. Teto de 30 páginas; redação no pretérito impessoal.</w:t>
       </w:r>
     </w:p>
     <w:sectPr>

</xml_diff>

<commit_message>
docs: alinha hipotese ao trade-off e refina resumo e discussao (#38)
Ajustes finais de redacao apontados na orientacao (sem mudanca de metodo):

- Hipotese realinhada ao enquadramento de trade-off ja adotado: integrar a
  governanca preservando a utilidade DENTRO DO ESCOPO AUTORIZADO, a um custo
  mensuravel e justificavel pelo menor privilegio (remove o "sem comprometer a
  utilidade", que os proprios dados ~11 pontos falsificavam). Conclusao alinhada.
- Resumo: "execucao determinista" -> "pipeline de dados determinista"; o numero
  do LLM e estabilidade empirica (3 execucoes, desvio nulo), nao determinismo.
- Discussao: frase do ponto de vista do usuario final (recebe um numero, nao a
  SQL) -> divergencias de forma nao reduzem a utilidade percebida, que se
  aproxima dos 94,4% do conteudo; reforca a tese de utilidade preservada.

Hipotese, pergunta de pesquisa e conclusao passam a contar a mesma historia.
Regenera .docx e PDF (16 paginas, validado).

Closes #37
</commit_message>
<xml_diff>
--- a/docs/tcc/Resultados_Preliminares_TCC.docx
+++ b/docs/tcc/Resultados_Preliminares_TCC.docx
@@ -71,7 +71,7 @@
         <w:jc w:val="both"/>
       </w:pPr>
       <w:r>
-        <w:t xml:space="preserve">Este trabalho propõe e implementa uma arquitetura de referência para Conversational Analytics em ambiente hospitalar, com governança integrada e aderente à LGPD, às normas da ANVISA e às diretrizes da ANPD, aplicada ao domínio de ocupação de leitos. O protótipo organiza um pipeline de dados em camadas (Bronze, Silver e Gold) sob um motor de tradução de perguntas em linguagem natural para SQL, com controles de governança na entrada e na saída e avaliação por execution match. Toda a pesquisa usa dados exclusivamente sintéticos e execução determinista. Os resultados preliminares confirmam a anonimização da camada exposta ao modelo e o funcionamento dos controles de governança. Numa avaliação com 18 perguntas (modelo claude-sonnet-4-6, temperatura zero, três execuções sem variação), o execution match estrito foi de 61,1%, enquanto o set match de conteúdo, métrica diagnóstica que ignora forma e bloqueios de governança, foi de 94,4%, indicando que a maior parte das divergências decorre da forma do resultado e do controle de acesso, e não de erro de cálculo do modelo (apenas 1 das 18). Dado o tamanho da amostra, os números são indicativos e reportados com intervalo de confiança; a investigação central não é atingir um limiar fixo de acurácia, mas caracterizar o equilíbrio entre utilidade e governança.</w:t>
+        <w:t xml:space="preserve">Este trabalho propõe e implementa uma arquitetura de referência para Conversational Analytics em ambiente hospitalar, com governança integrada e aderente à LGPD, às normas da ANVISA e às diretrizes da ANPD, aplicada ao domínio de ocupação de leitos. O protótipo organiza um pipeline de dados em camadas (Bronze, Silver e Gold) sob um motor de tradução de perguntas em linguagem natural para SQL, com controles de governança na entrada e na saída e avaliação por execution match. Toda a pesquisa usa dados exclusivamente sintéticos, com pipeline de dados determinista. Os resultados preliminares confirmam a anonimização da camada exposta ao modelo e o funcionamento dos controles de governança. Numa avaliação com 18 perguntas (modelo claude-sonnet-4-6, temperatura zero, três execuções sem variação), o execution match estrito foi de 61,1%, enquanto o set match de conteúdo, métrica diagnóstica que ignora forma e bloqueios de governança, foi de 94,4%, indicando que a maior parte das divergências decorre da forma do resultado e do controle de acesso, e não de erro de cálculo do modelo (apenas 1 das 18). Dado o tamanho da amostra, os números são indicativos e reportados com intervalo de confiança; a investigação central não é atingir um limiar fixo de acurácia, mas caracterizar o equilíbrio entre utilidade e governança.</w:t>
       </w:r>
     </w:p>
     <w:p>
@@ -114,7 +114,7 @@
         <w:jc w:val="both"/>
       </w:pPr>
       <w:r>
-        <w:t xml:space="preserve">Este trabalho parte da hipótese de que é possível integrar a governança à arquitetura de dados, de ponta a ponta, sem comprometer a utilidade da consulta em linguagem natural. Propõe-se uma arquitetura de referência em quatro camadas, na qual a anonimização, o controle de acesso por perfil, a validação da consulta e a auditoria atravessam todo o fluxo, da pergunta do usuário à resposta entregue. O domínio escolhido para implementação e avaliação é a ocupação de leitos hospitalares, e toda a pesquisa utiliza dados exclusivamente sintéticos, o que elimina na origem o risco de exposição de dados reais e permite que a arquitetura seja replicada por outras instituições.</w:t>
+        <w:t xml:space="preserve">Este trabalho parte da hipótese de que é possível integrar a governança à arquitetura de dados, de ponta a ponta, preservando a utilidade da consulta em linguagem natural dentro do escopo autorizado a cada perfil, a um custo mensurável e justificável pelo princípio do menor privilégio. Propõe-se uma arquitetura de referência em quatro camadas, na qual a anonimização, o controle de acesso por perfil, a validação da consulta e a auditoria atravessam todo o fluxo, da pergunta do usuário à resposta entregue. O domínio escolhido para implementação e avaliação é a ocupação de leitos hospitalares, e toda a pesquisa utiliza dados exclusivamente sintéticos, o que elimina na origem o risco de exposição de dados reais e permite que a arquitetura seja replicada por outras instituições.</w:t>
       </w:r>
     </w:p>
     <w:p>
@@ -2691,6 +2691,15 @@
         <w:t xml:space="preserve">A distância entre o execution match estrito (61,1%) e o set match de conteúdo (94,4%) é o resultado mais informativo: os 33 pontos de diferença não vêm de raciocínio errado, mas da forma do resultado e da governança. A Tabela 3 decompõe os dezoito casos. O conteúdo esteve correto em 17 deles; apenas um (Q12) apresentou erro de conteúdo. Esse único erro não é bem uma falha de raciocínio do modelo, mas uma lacuna de desenho do nosso pipeline: o prompt não expõe ao modelo os valores categóricos do schema, e ele filtrou um valor com a caixa incorreta ("enfermaria" em vez de "Enfermaria"), obtendo conjunto vazio. Esse ponto (value linking) já está no plano de continuidade. Manteve-se o execution match estrito como métrica primária; o set match de conteúdo é diagnóstico e acompanha a análise, sem substituí-la.</w:t>
       </w:r>
     </w:p>
+    <w:p>
+      <w:pPr>
+        <w:spacing w:after="120" w:line="360"/>
+        <w:jc w:val="both"/>
+      </w:pPr>
+      <w:r>
+        <w:t xml:space="preserve">Vale uma leitura do ponto de vista do usuário final. Um gestor recebe um número, não a SQL; para ele, as divergências de forma e projeção (colunas adicionais) tendem a não reduzir a utilidade percebida, ainda mais porque o filtro de saída já barra colunas sensíveis. Sob essa ótica, a utilidade operativa da resposta aproxima-se dos 94,4% do conteúdo correto, e os 61,1% do execution match estrito penalizam artefatos de forma que não enganam o usuário. Isso não rebaixa a métrica primária, mantida por comparabilidade, mas reforça a tese de utilidade preservada dentro do escopo autorizado.</w:t>
+      </w:r>
+    </w:p>
     <w:tbl>
       <w:tblPr>
         <w:tblW w:type="dxa" w:w="9071"/>
@@ -3867,7 +3876,7 @@
         <w:jc w:val="both"/>
       </w:pPr>
       <w:r>
-        <w:t xml:space="preserve">Os resultados preliminares confirmam a viabilidade técnica da arquitetura integrada: o pipeline de dados é coerente e anonimizado, os controles de governança funcionam de ponta a ponta e a avaliação produz números reais e verificáveis. Quanto à pergunta de pesquisa, os dados sugerem que a governança integrada preserva a utilidade da consulta a um custo mensurável e modesto: o conteúdo das respostas esteve correto em 17 de 18 casos (94,4%), enquanto o execution match estrito (61,1%) é puxado para baixo pela forma do resultado e pelo controle de acesso, não pelo raciocínio do modelo; o custo direto da governança foi de cerca de 11 pontos (2 respostas corretas, mas fora do escopo do perfil). Esses números, porém, vêm de uma amostra pequena, com intervalos de confiança amplos, e devem ser lidos como indicativos. Como continuidade, preveem-se o tratamento de value linking (exposição dos valores categóricos do schema ao modelo), a ampliação e estratificação do conjunto de avaliação por tipo de pergunta e por perfil (para estreitar os intervalos) e o aprofundamento da discussão sobre a métrica sensível à forma.</w:t>
+        <w:t xml:space="preserve">Os resultados preliminares confirmam a viabilidade técnica da arquitetura integrada: o pipeline de dados é coerente e anonimizado, os controles de governança funcionam de ponta a ponta e a avaliação produz números reais e verificáveis. Quanto à pergunta de pesquisa, os dados sugerem que a governança integrada preserva a utilidade da consulta dentro do escopo autorizado, a um custo mensurável e justificável pelo menor privilégio: o conteúdo das respostas esteve correto em 17 de 18 casos (94,4%), enquanto o execution match estrito (61,1%) é puxado para baixo pela forma do resultado e pelo controle de acesso, não pelo raciocínio do modelo; o custo direto da governança foi de cerca de 11 pontos (2 respostas corretas, mas fora do escopo do perfil). Esses números, porém, vêm de uma amostra pequena, com intervalos de confiança amplos, e devem ser lidos como indicativos. Como continuidade, preveem-se o tratamento de value linking (exposição dos valores categóricos do schema ao modelo), a ampliação e estratificação do conjunto de avaliação por tipo de pergunta e por perfil (para estreitar os intervalos) e o aprofundamento da discussão sobre a métrica sensível à forma.</w:t>
       </w:r>
     </w:p>
     <w:p>

</xml_diff>